<commit_message>
Rà soát bản toàn văn: chỉ giữ các phát hiện về tính chính xác của nội dung
Bỏ các nhận xét về khung, bố cục, trình bày và văn phong theo yêu cầu; bổ sung các nội dung đã đối chiếu khớp nguồn.

Co-Authored-By: Claude Opus 5.5 <noreply@anthropic.com>
Claude-Session: https://claude.ai/code/session_01ThGArqDrUUsqC1zG1BQvVL
</commit_message>
<xml_diff>
--- a/Ban_cuoi/Ban_hoan_thien_03-10-2026/Bao_cao_ra_soat_liem_chinh_toan_van.docx
+++ b/Ban_cuoi/Ban_hoan_thien_03-10-2026/Bao_cao_ra_soat_liem_chinh_toan_van.docx
@@ -74,7 +74,7 @@
           <w:i w:val="0"/>
           <w:sz w:val="26"/>
         </w:rPr>
-        <w:t>Mức độ: A là lỗi phải sửa trước khi nộp (sai quy định pháp luật, sai số liệu, tài liệu tham khảo sai hoặc không kiểm chứng, khai phương pháp không thực hiện); B là lỗi cần sửa; C là lỗi hình thức.</w:t>
+        <w:t>Phạm vi: chỉ kiểm tra tính chính xác của nội dung, không đánh giá bố cục, cách trình bày hay văn phong. Mức độ: A là lỗi phải sửa trước khi nộp (sai quy định pháp luật, sai số liệu, tài liệu tham khảo sai, khai phương pháp không thực hiện); B là lỗi cần sửa; C là sai sót nhỏ.</w:t>
       </w:r>
     </w:p>
     <w:p>
@@ -104,7 +104,7 @@
           <w:i w:val="0"/>
           <w:sz w:val="26"/>
         </w:rPr>
-        <w:t>Có 48 phát hiện, trong đó 16 lỗi mức A, 25 lỗi mức B và 7 lỗi mức C. Báo cáo chưa đủ điều kiện nộp nghiệm thu nếu chưa sửa các lỗi mức A. Năm vấn đề chính:</w:t>
+        <w:t>Có 42 phát hiện, trong đó 16 lỗi mức A, 24 lỗi mức B và 2 lỗi mức C. Báo cáo chưa đủ điều kiện nộp nghiệm thu nếu chưa sửa các lỗi mức A. Bốn vấn đề chính:</w:t>
       </w:r>
     </w:p>
     <w:p>
@@ -173,22 +173,6 @@
     </w:p>
     <w:p>
       <w:pPr>
-        <w:spacing w:before="0" w:after="60" w:line="276" w:lineRule="auto"/>
-        <w:ind w:left="340"/>
-        <w:jc w:val="both"/>
-      </w:pPr>
-      <w:r>
-        <w:rPr>
-          <w:rFonts w:ascii="Times New Roman" w:hAnsi="Times New Roman" w:eastAsia="Times New Roman"/>
-          <w:b w:val="0"/>
-          <w:i w:val="0"/>
-          <w:sz w:val="26"/>
-        </w:rPr>
-        <w:t>- Thân bài không khớp khung đã chốt; hình vẽ bằng ký tự; đánh số bảng, hình không theo thứ tự.</w:t>
-      </w:r>
-    </w:p>
-    <w:p>
-      <w:pPr>
         <w:spacing w:before="120" w:after="120" w:line="276" w:lineRule="auto"/>
         <w:jc w:val="both"/>
       </w:pPr>
@@ -215,7 +199,7 @@
           <w:i w:val="0"/>
           <w:sz w:val="26"/>
         </w:rPr>
-        <w:t>- Nhân lực năm 2026 (Bảng 2.1) khớp danh sách nhân sự ở dạng tổng hợp: 252 nhân sự, 145 giảng viên; Phòng KHCN có 02 nhân sự trình độ thạc sĩ.</w:t>
+        <w:t>- Bảng 2.1 khớp từng dòng với danh sách nhân sự ở dạng tổng hợp (252 nhân sự, 145 giảng viên, 94 tiến sĩ, 25 GS và PGS); các tỷ lệ 37,3%, 57,9%, 86,2%, 88,0%; Phòng KHCN có 02 nhân sự trình độ thạc sĩ; số ngành của ba viện.</w:t>
       </w:r>
     </w:p>
     <w:p>
@@ -231,7 +215,23 @@
           <w:i w:val="0"/>
           <w:sz w:val="26"/>
         </w:rPr>
-        <w:t>- Bảng 2.2 sản phẩm khoa học 2021 - 2025, tổng kinh phí 424,75 triệu đồng và cơ cấu 19/16/3, 71 bài quốc tế có phân hạng, hệ số Gini 0,836 và tỷ lệ 38,3%.</w:t>
+        <w:t>- Bảng 2.2 khớp từng ô; các phép tính 3,43 lần, 36,1%/năm, 7 lần, 62,7%/năm, tỷ trọng 41,1% và 83,9%; tổng kinh phí 424,75 triệu đồng và cơ cấu 19/16/3; 396,75 triệu đồng (93,4%); 71 bài quốc tế có phân hạng; hệ số Gini 0,836 và tỷ lệ 38,3%; ba đề tài NAFOSTED 4,67 tỷ đồng và ngày phê duyệt.</w:t>
+      </w:r>
+    </w:p>
+    <w:p>
+      <w:pPr>
+        <w:spacing w:before="0" w:after="60" w:line="276" w:lineRule="auto"/>
+        <w:ind w:left="340"/>
+        <w:jc w:val="both"/>
+      </w:pPr>
+      <w:r>
+        <w:rPr>
+          <w:rFonts w:ascii="Times New Roman" w:hAnsi="Times New Roman" w:eastAsia="Times New Roman"/>
+          <w:b w:val="0"/>
+          <w:i w:val="0"/>
+          <w:sz w:val="26"/>
+        </w:rPr>
+        <w:t>- Bảng 2.7: mã số, sản phẩm, nhóm quyền và ngày nghiệm thu khớp danh mục đề tài (trừ cột đơn vị, xem phát hiện số 30).</w:t>
       </w:r>
     </w:p>
     <w:p>
@@ -819,7 +819,7 @@
                 <w:i w:val="0"/>
                 <w:sz w:val="21"/>
               </w:rPr>
-              <w:t>Không có trong thuyết minh hay quyết định giao đề tài trong hồ sơ. Theo thống nhất trước đó, mã số để trống để chủ nhiệm tự điền.</w:t>
+              <w:t>Không có trong thuyết minh hay văn bản giao đề tài trong hồ sơ.</w:t>
             </w:r>
           </w:p>
         </w:tc>
@@ -862,7 +862,7 @@
                 <w:i w:val="0"/>
                 <w:sz w:val="21"/>
               </w:rPr>
-              <w:t>Để trống hoặc điền đúng mã số trên quyết định giao đề tài.</w:t>
+              <w:t>Đối chiếu với quyết định giao đề tài.</w:t>
             </w:r>
           </w:p>
         </w:tc>
@@ -3847,7 +3847,7 @@
                 <w:color w:val="595959"/>
                 <w:sz w:val="21"/>
               </w:rPr>
-              <w:t>C - Hình thức</w:t>
+              <w:t>C - Sai sót nhỏ</w:t>
             </w:r>
           </w:p>
         </w:tc>
@@ -4789,7 +4789,7 @@
                 <w:color w:val="595959"/>
                 <w:sz w:val="21"/>
               </w:rPr>
-              <w:t>C - Hình thức</w:t>
+              <w:t>C - Sai sót nhỏ</w:t>
             </w:r>
           </w:p>
         </w:tc>
@@ -5322,7 +5322,7 @@
                 <w:i w:val="0"/>
                 <w:sz w:val="21"/>
               </w:rPr>
-              <w:t>Đối chiếu bản PDF, tệp Zotero và danh mục đã kiểm chứng: danh mục ở cuối sai thông tin xuất bản của 15 tài liệu (chi tiết ở Bảng 2). Thông tin xuất bản sai khiến người đọc không truy xuất được tài liệu, nên là lỗi liêm chính.</w:t>
+              <w:t>Đối chiếu bản PDF và tệp Zotero: danh mục ở cuối sai thông tin xuất bản của 15 tài liệu (chi tiết ở Bảng 2). Thông tin xuất bản sai khiến người đọc không truy xuất được tài liệu, nên là lỗi liêm chính.</w:t>
             </w:r>
           </w:p>
         </w:tc>
@@ -5365,7 +5365,7 @@
                 <w:i w:val="0"/>
                 <w:sz w:val="21"/>
               </w:rPr>
-              <w:t>Thay danh mục cuối bằng danh mục đã kiểm chứng; bỏ danh mục trùng ở Mở đầu.</w:t>
+              <w:t>Sửa thông tin xuất bản theo Bảng 2.</w:t>
             </w:r>
           </w:p>
         </w:tc>
@@ -6269,135 +6269,6 @@
                 <w:sz w:val="21"/>
               </w:rPr>
               <w:t>Dùng họ và năm theo APA, ví dụ (Lê &amp; Nguyễn, 2019), trừ khi đã kiểm tra tên trên bài gốc.</w:t>
-            </w:r>
-          </w:p>
-        </w:tc>
-      </w:tr>
-      <w:tr>
-        <w:tc>
-          <w:tcPr>
-            <w:tcW w:type="dxa" w:w="737"/>
-          </w:tcPr>
-          <w:p>
-            <w:pPr>
-              <w:spacing w:after="40"/>
-              <w:jc w:val="center"/>
-            </w:pPr>
-            <w:r/>
-            <w:r>
-              <w:rPr>
-                <w:rFonts w:ascii="Times New Roman" w:hAnsi="Times New Roman" w:eastAsia="Times New Roman"/>
-                <w:b w:val="0"/>
-                <w:i w:val="0"/>
-                <w:sz w:val="21"/>
-              </w:rPr>
-              <w:t>42</w:t>
-            </w:r>
-          </w:p>
-        </w:tc>
-        <w:tc>
-          <w:tcPr>
-            <w:tcW w:type="dxa" w:w="1701"/>
-          </w:tcPr>
-          <w:p>
-            <w:pPr>
-              <w:spacing w:after="40"/>
-              <w:jc w:val="left"/>
-            </w:pPr>
-            <w:r/>
-            <w:r>
-              <w:rPr>
-                <w:rFonts w:ascii="Times New Roman" w:hAnsi="Times New Roman" w:eastAsia="Times New Roman"/>
-                <w:b w:val="0"/>
-                <w:i w:val="0"/>
-                <w:sz w:val="21"/>
-              </w:rPr>
-              <w:t>Toàn bài</w:t>
-            </w:r>
-          </w:p>
-        </w:tc>
-        <w:tc>
-          <w:tcPr>
-            <w:tcW w:type="dxa" w:w="3515"/>
-          </w:tcPr>
-          <w:p>
-            <w:pPr>
-              <w:spacing w:after="40"/>
-              <w:jc w:val="left"/>
-            </w:pPr>
-            <w:r/>
-            <w:r>
-              <w:rPr>
-                <w:rFonts w:ascii="Times New Roman" w:hAnsi="Times New Roman" w:eastAsia="Times New Roman"/>
-                <w:b w:val="0"/>
-                <w:i w:val="0"/>
-                <w:sz w:val="21"/>
-              </w:rPr>
-              <w:t>Trích dẫn trong bài dạng (năm 2019), (Phạm Thúy Hằng, năm 2019); dùng các từ chứng minh, khẳng định cho nghiên cứu định tính.</w:t>
-            </w:r>
-          </w:p>
-        </w:tc>
-        <w:tc>
-          <w:tcPr>
-            <w:tcW w:type="dxa" w:w="4535"/>
-          </w:tcPr>
-          <w:p>
-            <w:pPr>
-              <w:spacing w:after="40"/>
-              <w:jc w:val="left"/>
-            </w:pPr>
-            <w:r/>
-            <w:r>
-              <w:rPr>
-                <w:rFonts w:ascii="Times New Roman" w:hAnsi="Times New Roman" w:eastAsia="Times New Roman"/>
-                <w:b w:val="0"/>
-                <w:i w:val="0"/>
-                <w:sz w:val="21"/>
-              </w:rPr>
-              <w:t>Không đúng APA 7; mức độ khẳng định vượt nội dung nguồn.</w:t>
-            </w:r>
-          </w:p>
-        </w:tc>
-        <w:tc>
-          <w:tcPr>
-            <w:tcW w:type="dxa" w:w="1247"/>
-          </w:tcPr>
-          <w:p>
-            <w:pPr>
-              <w:spacing w:after="40"/>
-              <w:jc w:val="center"/>
-            </w:pPr>
-            <w:r/>
-            <w:r>
-              <w:rPr>
-                <w:rFonts w:ascii="Times New Roman" w:hAnsi="Times New Roman" w:eastAsia="Times New Roman"/>
-                <w:b/>
-                <w:i w:val="0"/>
-                <w:color w:val="595959"/>
-                <w:sz w:val="21"/>
-              </w:rPr>
-              <w:t>C - Hình thức</w:t>
-            </w:r>
-          </w:p>
-        </w:tc>
-        <w:tc>
-          <w:tcPr>
-            <w:tcW w:type="dxa" w:w="2835"/>
-          </w:tcPr>
-          <w:p>
-            <w:pPr>
-              <w:spacing w:after="40"/>
-              <w:jc w:val="left"/>
-            </w:pPr>
-            <w:r/>
-            <w:r>
-              <w:rPr>
-                <w:rFonts w:ascii="Times New Roman" w:hAnsi="Times New Roman" w:eastAsia="Times New Roman"/>
-                <w:b w:val="0"/>
-                <w:i w:val="0"/>
-                <w:sz w:val="21"/>
-              </w:rPr>
-              <w:t>Chuyển sang (Phạm, 2019); thay chứng minh bằng cho thấy.</w:t>
             </w:r>
           </w:p>
         </w:tc>
@@ -6415,7 +6286,7 @@
           <w:i w:val="0"/>
           <w:sz w:val="24"/>
         </w:rPr>
-        <w:t>5. Cấu trúc và hình thức</w:t>
+        <w:t>5. Dẫn chiếu nội bộ</w:t>
       </w:r>
     </w:p>
     <w:tbl>
@@ -6588,7 +6459,7 @@
                 <w:i w:val="0"/>
                 <w:sz w:val="21"/>
               </w:rPr>
-              <w:t>43</w:t>
+              <w:t>42</w:t>
             </w:r>
           </w:p>
         </w:tc>
@@ -6609,7 +6480,7 @@
                 <w:i w:val="0"/>
                 <w:sz w:val="21"/>
               </w:rPr>
-              <w:t>Mục lục và thân bài</w:t>
+              <w:t>2.2.4; 3.4</w:t>
             </w:r>
           </w:p>
         </w:tc>
@@ -6630,7 +6501,7 @@
                 <w:i w:val="0"/>
                 <w:sz w:val="21"/>
               </w:rPr>
-              <w:t>Mục lục theo khung đã chốt nhưng thân bài có 1.1.1 - 1.1.3, 2.3.3, Chương 3 gồm 3.1 - 3.4, tên các phần Kết luận cũng khác mục lục.</w:t>
+              <w:t>Dẫn chiếu bộ 16 chỉ tiêu đã xác lập tại Mục 1.4.1 ở Chương 1.</w:t>
             </w:r>
           </w:p>
         </w:tc>
@@ -6651,7 +6522,7 @@
                 <w:i w:val="0"/>
                 <w:sz w:val="21"/>
               </w:rPr>
-              <w:t>Thân bài không khớp mục lục và khung đã chốt.</w:t>
+              <w:t>Báo cáo không có Mục 1.4.1; Chương 1 chỉ nêu bốn nhóm tiêu chí, không có danh sách 16 chỉ tiêu được đánh số như Hình 2.6 sử dụng.</w:t>
             </w:r>
           </w:p>
         </w:tc>
@@ -6694,652 +6565,7 @@
                 <w:i w:val="0"/>
                 <w:sz w:val="21"/>
               </w:rPr>
-              <w:t>Đưa thân bài về đúng khung đã chốt.</w:t>
-            </w:r>
-          </w:p>
-        </w:tc>
-      </w:tr>
-      <w:tr>
-        <w:tc>
-          <w:tcPr>
-            <w:tcW w:type="dxa" w:w="737"/>
-          </w:tcPr>
-          <w:p>
-            <w:pPr>
-              <w:spacing w:after="40"/>
-              <w:jc w:val="center"/>
-            </w:pPr>
-            <w:r/>
-            <w:r>
-              <w:rPr>
-                <w:rFonts w:ascii="Times New Roman" w:hAnsi="Times New Roman" w:eastAsia="Times New Roman"/>
-                <w:b w:val="0"/>
-                <w:i w:val="0"/>
-                <w:sz w:val="21"/>
-              </w:rPr>
-              <w:t>44</w:t>
-            </w:r>
-          </w:p>
-        </w:tc>
-        <w:tc>
-          <w:tcPr>
-            <w:tcW w:type="dxa" w:w="1701"/>
-          </w:tcPr>
-          <w:p>
-            <w:pPr>
-              <w:spacing w:after="40"/>
-              <w:jc w:val="left"/>
-            </w:pPr>
-            <w:r/>
-            <w:r>
-              <w:rPr>
-                <w:rFonts w:ascii="Times New Roman" w:hAnsi="Times New Roman" w:eastAsia="Times New Roman"/>
-                <w:b w:val="0"/>
-                <w:i w:val="0"/>
-                <w:sz w:val="21"/>
-              </w:rPr>
-              <w:t>2.2.4; 3.4</w:t>
-            </w:r>
-          </w:p>
-        </w:tc>
-        <w:tc>
-          <w:tcPr>
-            <w:tcW w:type="dxa" w:w="3515"/>
-          </w:tcPr>
-          <w:p>
-            <w:pPr>
-              <w:spacing w:after="40"/>
-              <w:jc w:val="left"/>
-            </w:pPr>
-            <w:r/>
-            <w:r>
-              <w:rPr>
-                <w:rFonts w:ascii="Times New Roman" w:hAnsi="Times New Roman" w:eastAsia="Times New Roman"/>
-                <w:b w:val="0"/>
-                <w:i w:val="0"/>
-                <w:sz w:val="21"/>
-              </w:rPr>
-              <w:t>Dẫn chiếu bộ 16 chỉ tiêu tại Mục 1.4.1.</w:t>
-            </w:r>
-          </w:p>
-        </w:tc>
-        <w:tc>
-          <w:tcPr>
-            <w:tcW w:type="dxa" w:w="4535"/>
-          </w:tcPr>
-          <w:p>
-            <w:pPr>
-              <w:spacing w:after="40"/>
-              <w:jc w:val="left"/>
-            </w:pPr>
-            <w:r/>
-            <w:r>
-              <w:rPr>
-                <w:rFonts w:ascii="Times New Roman" w:hAnsi="Times New Roman" w:eastAsia="Times New Roman"/>
-                <w:b w:val="0"/>
-                <w:i w:val="0"/>
-                <w:sz w:val="21"/>
-              </w:rPr>
-              <w:t>Báo cáo không có Mục 1.4.1; Chương 1 chỉ nêu bốn nhóm tiêu chí, không đánh số 16 chỉ tiêu.</w:t>
-            </w:r>
-          </w:p>
-        </w:tc>
-        <w:tc>
-          <w:tcPr>
-            <w:tcW w:type="dxa" w:w="1247"/>
-          </w:tcPr>
-          <w:p>
-            <w:pPr>
-              <w:spacing w:after="40"/>
-              <w:jc w:val="center"/>
-            </w:pPr>
-            <w:r/>
-            <w:r>
-              <w:rPr>
-                <w:rFonts w:ascii="Times New Roman" w:hAnsi="Times New Roman" w:eastAsia="Times New Roman"/>
-                <w:b/>
-                <w:i w:val="0"/>
-                <w:color w:val="B45F06"/>
-                <w:sz w:val="21"/>
-              </w:rPr>
-              <w:t>B - Cần sửa</w:t>
-            </w:r>
-          </w:p>
-        </w:tc>
-        <w:tc>
-          <w:tcPr>
-            <w:tcW w:type="dxa" w:w="2835"/>
-          </w:tcPr>
-          <w:p>
-            <w:pPr>
-              <w:spacing w:after="40"/>
-              <w:jc w:val="left"/>
-            </w:pPr>
-            <w:r/>
-            <w:r>
-              <w:rPr>
-                <w:rFonts w:ascii="Times New Roman" w:hAnsi="Times New Roman" w:eastAsia="Times New Roman"/>
-                <w:b w:val="0"/>
-                <w:i w:val="0"/>
-                <w:sz w:val="21"/>
-              </w:rPr>
-              <w:t>Bổ sung bảng 16 chỉ tiêu ở Chương 1 hoặc sửa dẫn chiếu.</w:t>
-            </w:r>
-          </w:p>
-        </w:tc>
-      </w:tr>
-      <w:tr>
-        <w:tc>
-          <w:tcPr>
-            <w:tcW w:type="dxa" w:w="737"/>
-          </w:tcPr>
-          <w:p>
-            <w:pPr>
-              <w:spacing w:after="40"/>
-              <w:jc w:val="center"/>
-            </w:pPr>
-            <w:r/>
-            <w:r>
-              <w:rPr>
-                <w:rFonts w:ascii="Times New Roman" w:hAnsi="Times New Roman" w:eastAsia="Times New Roman"/>
-                <w:b w:val="0"/>
-                <w:i w:val="0"/>
-                <w:sz w:val="21"/>
-              </w:rPr>
-              <w:t>45</w:t>
-            </w:r>
-          </w:p>
-        </w:tc>
-        <w:tc>
-          <w:tcPr>
-            <w:tcW w:type="dxa" w:w="1701"/>
-          </w:tcPr>
-          <w:p>
-            <w:pPr>
-              <w:spacing w:after="40"/>
-              <w:jc w:val="left"/>
-            </w:pPr>
-            <w:r/>
-            <w:r>
-              <w:rPr>
-                <w:rFonts w:ascii="Times New Roman" w:hAnsi="Times New Roman" w:eastAsia="Times New Roman"/>
-                <w:b w:val="0"/>
-                <w:i w:val="0"/>
-                <w:sz w:val="21"/>
-              </w:rPr>
-              <w:t>Chương 2</w:t>
-            </w:r>
-          </w:p>
-        </w:tc>
-        <w:tc>
-          <w:tcPr>
-            <w:tcW w:type="dxa" w:w="3515"/>
-          </w:tcPr>
-          <w:p>
-            <w:pPr>
-              <w:spacing w:after="40"/>
-              <w:jc w:val="left"/>
-            </w:pPr>
-            <w:r/>
-            <w:r>
-              <w:rPr>
-                <w:rFonts w:ascii="Times New Roman" w:hAnsi="Times New Roman" w:eastAsia="Times New Roman"/>
-                <w:b w:val="0"/>
-                <w:i w:val="0"/>
-                <w:sz w:val="21"/>
-              </w:rPr>
-              <w:t>Bảng đánh số 2.1, 2.2, 2.4, 2.7, 2.5, 2.6, 2.3 theo thứ tự xuất hiện; hình đánh số 2.3, 2.1, 2.4, 2.5, 2.8, 2.7, 2.9, 2.2, 2.6, 2.10, 2.11.</w:t>
-            </w:r>
-          </w:p>
-        </w:tc>
-        <w:tc>
-          <w:tcPr>
-            <w:tcW w:type="dxa" w:w="4535"/>
-          </w:tcPr>
-          <w:p>
-            <w:pPr>
-              <w:spacing w:after="40"/>
-              <w:jc w:val="left"/>
-            </w:pPr>
-            <w:r/>
-            <w:r>
-              <w:rPr>
-                <w:rFonts w:ascii="Times New Roman" w:hAnsi="Times New Roman" w:eastAsia="Times New Roman"/>
-                <w:b w:val="0"/>
-                <w:i w:val="0"/>
-                <w:sz w:val="21"/>
-              </w:rPr>
-              <w:t>Đánh số không theo thứ tự xuất hiện.</w:t>
-            </w:r>
-          </w:p>
-        </w:tc>
-        <w:tc>
-          <w:tcPr>
-            <w:tcW w:type="dxa" w:w="1247"/>
-          </w:tcPr>
-          <w:p>
-            <w:pPr>
-              <w:spacing w:after="40"/>
-              <w:jc w:val="center"/>
-            </w:pPr>
-            <w:r/>
-            <w:r>
-              <w:rPr>
-                <w:rFonts w:ascii="Times New Roman" w:hAnsi="Times New Roman" w:eastAsia="Times New Roman"/>
-                <w:b/>
-                <w:i w:val="0"/>
-                <w:color w:val="595959"/>
-                <w:sz w:val="21"/>
-              </w:rPr>
-              <w:t>C - Hình thức</w:t>
-            </w:r>
-          </w:p>
-        </w:tc>
-        <w:tc>
-          <w:tcPr>
-            <w:tcW w:type="dxa" w:w="2835"/>
-          </w:tcPr>
-          <w:p>
-            <w:pPr>
-              <w:spacing w:after="40"/>
-              <w:jc w:val="left"/>
-            </w:pPr>
-            <w:r/>
-            <w:r>
-              <w:rPr>
-                <w:rFonts w:ascii="Times New Roman" w:hAnsi="Times New Roman" w:eastAsia="Times New Roman"/>
-                <w:b w:val="0"/>
-                <w:i w:val="0"/>
-                <w:sz w:val="21"/>
-              </w:rPr>
-              <w:t>Đánh số lại theo thứ tự xuất hiện.</w:t>
-            </w:r>
-          </w:p>
-        </w:tc>
-      </w:tr>
-      <w:tr>
-        <w:tc>
-          <w:tcPr>
-            <w:tcW w:type="dxa" w:w="737"/>
-          </w:tcPr>
-          <w:p>
-            <w:pPr>
-              <w:spacing w:after="40"/>
-              <w:jc w:val="center"/>
-            </w:pPr>
-            <w:r/>
-            <w:r>
-              <w:rPr>
-                <w:rFonts w:ascii="Times New Roman" w:hAnsi="Times New Roman" w:eastAsia="Times New Roman"/>
-                <w:b w:val="0"/>
-                <w:i w:val="0"/>
-                <w:sz w:val="21"/>
-              </w:rPr>
-              <w:t>46</w:t>
-            </w:r>
-          </w:p>
-        </w:tc>
-        <w:tc>
-          <w:tcPr>
-            <w:tcW w:type="dxa" w:w="1701"/>
-          </w:tcPr>
-          <w:p>
-            <w:pPr>
-              <w:spacing w:after="40"/>
-              <w:jc w:val="left"/>
-            </w:pPr>
-            <w:r/>
-            <w:r>
-              <w:rPr>
-                <w:rFonts w:ascii="Times New Roman" w:hAnsi="Times New Roman" w:eastAsia="Times New Roman"/>
-                <w:b w:val="0"/>
-                <w:i w:val="0"/>
-                <w:sz w:val="21"/>
-              </w:rPr>
-              <w:t>Các hình ở Chương 2 và 3</w:t>
-            </w:r>
-          </w:p>
-        </w:tc>
-        <w:tc>
-          <w:tcPr>
-            <w:tcW w:type="dxa" w:w="3515"/>
-          </w:tcPr>
-          <w:p>
-            <w:pPr>
-              <w:spacing w:after="40"/>
-              <w:jc w:val="left"/>
-            </w:pPr>
-            <w:r/>
-            <w:r>
-              <w:rPr>
-                <w:rFonts w:ascii="Times New Roman" w:hAnsi="Times New Roman" w:eastAsia="Times New Roman"/>
-                <w:b w:val="0"/>
-                <w:i w:val="0"/>
-                <w:sz w:val="21"/>
-              </w:rPr>
-              <w:t>Hình vẽ bằng ký tự (dấu gạch, dấu cộng); còn sót ký hiệu Markdown (####, :---, **, *).</w:t>
-            </w:r>
-          </w:p>
-        </w:tc>
-        <w:tc>
-          <w:tcPr>
-            <w:tcW w:type="dxa" w:w="4535"/>
-          </w:tcPr>
-          <w:p>
-            <w:pPr>
-              <w:spacing w:after="40"/>
-              <w:jc w:val="left"/>
-            </w:pPr>
-            <w:r/>
-            <w:r>
-              <w:rPr>
-                <w:rFonts w:ascii="Times New Roman" w:hAnsi="Times New Roman" w:eastAsia="Times New Roman"/>
-                <w:b w:val="0"/>
-                <w:i w:val="0"/>
-                <w:sz w:val="21"/>
-              </w:rPr>
-              <w:t>Không dùng được trong báo cáo in nộp nghiệm thu.</w:t>
-            </w:r>
-          </w:p>
-        </w:tc>
-        <w:tc>
-          <w:tcPr>
-            <w:tcW w:type="dxa" w:w="1247"/>
-          </w:tcPr>
-          <w:p>
-            <w:pPr>
-              <w:spacing w:after="40"/>
-              <w:jc w:val="center"/>
-            </w:pPr>
-            <w:r/>
-            <w:r>
-              <w:rPr>
-                <w:rFonts w:ascii="Times New Roman" w:hAnsi="Times New Roman" w:eastAsia="Times New Roman"/>
-                <w:b/>
-                <w:i w:val="0"/>
-                <w:color w:val="595959"/>
-                <w:sz w:val="21"/>
-              </w:rPr>
-              <w:t>C - Hình thức</w:t>
-            </w:r>
-          </w:p>
-        </w:tc>
-        <w:tc>
-          <w:tcPr>
-            <w:tcW w:type="dxa" w:w="2835"/>
-          </w:tcPr>
-          <w:p>
-            <w:pPr>
-              <w:spacing w:after="40"/>
-              <w:jc w:val="left"/>
-            </w:pPr>
-            <w:r/>
-            <w:r>
-              <w:rPr>
-                <w:rFonts w:ascii="Times New Roman" w:hAnsi="Times New Roman" w:eastAsia="Times New Roman"/>
-                <w:b w:val="0"/>
-                <w:i w:val="0"/>
-                <w:sz w:val="21"/>
-              </w:rPr>
-              <w:t>Thay bằng biểu đồ và sơ đồ đã dựng ở bản trước.</w:t>
-            </w:r>
-          </w:p>
-        </w:tc>
-      </w:tr>
-      <w:tr>
-        <w:tc>
-          <w:tcPr>
-            <w:tcW w:type="dxa" w:w="737"/>
-          </w:tcPr>
-          <w:p>
-            <w:pPr>
-              <w:spacing w:after="40"/>
-              <w:jc w:val="center"/>
-            </w:pPr>
-            <w:r/>
-            <w:r>
-              <w:rPr>
-                <w:rFonts w:ascii="Times New Roman" w:hAnsi="Times New Roman" w:eastAsia="Times New Roman"/>
-                <w:b w:val="0"/>
-                <w:i w:val="0"/>
-                <w:sz w:val="21"/>
-              </w:rPr>
-              <w:t>47</w:t>
-            </w:r>
-          </w:p>
-        </w:tc>
-        <w:tc>
-          <w:tcPr>
-            <w:tcW w:type="dxa" w:w="1701"/>
-          </w:tcPr>
-          <w:p>
-            <w:pPr>
-              <w:spacing w:after="40"/>
-              <w:jc w:val="left"/>
-            </w:pPr>
-            <w:r/>
-            <w:r>
-              <w:rPr>
-                <w:rFonts w:ascii="Times New Roman" w:hAnsi="Times New Roman" w:eastAsia="Times New Roman"/>
-                <w:b w:val="0"/>
-                <w:i w:val="0"/>
-                <w:sz w:val="21"/>
-              </w:rPr>
-              <w:t>Mục lục</w:t>
-            </w:r>
-          </w:p>
-        </w:tc>
-        <w:tc>
-          <w:tcPr>
-            <w:tcW w:type="dxa" w:w="3515"/>
-          </w:tcPr>
-          <w:p>
-            <w:pPr>
-              <w:spacing w:after="40"/>
-              <w:jc w:val="left"/>
-            </w:pPr>
-            <w:r/>
-            <w:r>
-              <w:rPr>
-                <w:rFonts w:ascii="Times New Roman" w:hAnsi="Times New Roman" w:eastAsia="Times New Roman"/>
-                <w:b w:val="0"/>
-                <w:i w:val="0"/>
-                <w:sz w:val="21"/>
-              </w:rPr>
-              <w:t>Có mục Phụ lục.</w:t>
-            </w:r>
-          </w:p>
-        </w:tc>
-        <w:tc>
-          <w:tcPr>
-            <w:tcW w:type="dxa" w:w="4535"/>
-          </w:tcPr>
-          <w:p>
-            <w:pPr>
-              <w:spacing w:after="40"/>
-              <w:jc w:val="left"/>
-            </w:pPr>
-            <w:r/>
-            <w:r>
-              <w:rPr>
-                <w:rFonts w:ascii="Times New Roman" w:hAnsi="Times New Roman" w:eastAsia="Times New Roman"/>
-                <w:b w:val="0"/>
-                <w:i w:val="0"/>
-                <w:sz w:val="21"/>
-              </w:rPr>
-              <w:t>Báo cáo không có phụ lục.</w:t>
-            </w:r>
-          </w:p>
-        </w:tc>
-        <w:tc>
-          <w:tcPr>
-            <w:tcW w:type="dxa" w:w="1247"/>
-          </w:tcPr>
-          <w:p>
-            <w:pPr>
-              <w:spacing w:after="40"/>
-              <w:jc w:val="center"/>
-            </w:pPr>
-            <w:r/>
-            <w:r>
-              <w:rPr>
-                <w:rFonts w:ascii="Times New Roman" w:hAnsi="Times New Roman" w:eastAsia="Times New Roman"/>
-                <w:b/>
-                <w:i w:val="0"/>
-                <w:color w:val="595959"/>
-                <w:sz w:val="21"/>
-              </w:rPr>
-              <w:t>C - Hình thức</w:t>
-            </w:r>
-          </w:p>
-        </w:tc>
-        <w:tc>
-          <w:tcPr>
-            <w:tcW w:type="dxa" w:w="2835"/>
-          </w:tcPr>
-          <w:p>
-            <w:pPr>
-              <w:spacing w:after="40"/>
-              <w:jc w:val="left"/>
-            </w:pPr>
-            <w:r/>
-            <w:r>
-              <w:rPr>
-                <w:rFonts w:ascii="Times New Roman" w:hAnsi="Times New Roman" w:eastAsia="Times New Roman"/>
-                <w:b w:val="0"/>
-                <w:i w:val="0"/>
-                <w:sz w:val="21"/>
-              </w:rPr>
-              <w:t>Bỏ mục hoặc bổ sung phụ lục.</w:t>
-            </w:r>
-          </w:p>
-        </w:tc>
-      </w:tr>
-      <w:tr>
-        <w:tc>
-          <w:tcPr>
-            <w:tcW w:type="dxa" w:w="737"/>
-          </w:tcPr>
-          <w:p>
-            <w:pPr>
-              <w:spacing w:after="40"/>
-              <w:jc w:val="center"/>
-            </w:pPr>
-            <w:r/>
-            <w:r>
-              <w:rPr>
-                <w:rFonts w:ascii="Times New Roman" w:hAnsi="Times New Roman" w:eastAsia="Times New Roman"/>
-                <w:b w:val="0"/>
-                <w:i w:val="0"/>
-                <w:sz w:val="21"/>
-              </w:rPr>
-              <w:t>48</w:t>
-            </w:r>
-          </w:p>
-        </w:tc>
-        <w:tc>
-          <w:tcPr>
-            <w:tcW w:type="dxa" w:w="1701"/>
-          </w:tcPr>
-          <w:p>
-            <w:pPr>
-              <w:spacing w:after="40"/>
-              <w:jc w:val="left"/>
-            </w:pPr>
-            <w:r/>
-            <w:r>
-              <w:rPr>
-                <w:rFonts w:ascii="Times New Roman" w:hAnsi="Times New Roman" w:eastAsia="Times New Roman"/>
-                <w:b w:val="0"/>
-                <w:i w:val="0"/>
-                <w:sz w:val="21"/>
-              </w:rPr>
-              <w:t>Toàn bài</w:t>
-            </w:r>
-          </w:p>
-        </w:tc>
-        <w:tc>
-          <w:tcPr>
-            <w:tcW w:type="dxa" w:w="3515"/>
-          </w:tcPr>
-          <w:p>
-            <w:pPr>
-              <w:spacing w:after="40"/>
-              <w:jc w:val="left"/>
-            </w:pPr>
-            <w:r/>
-            <w:r>
-              <w:rPr>
-                <w:rFonts w:ascii="Times New Roman" w:hAnsi="Times New Roman" w:eastAsia="Times New Roman"/>
-                <w:b w:val="0"/>
-                <w:i w:val="0"/>
-                <w:sz w:val="21"/>
-              </w:rPr>
-              <w:t>Nhiều cụm sáo ngữ và tuyệt đối: đột phá, bứt phá, nhảy vọt, mổ xẻ, chìa khóa then chốt, triệt tiêu, tuyệt đối, cực kỳ nghiêm trọng.</w:t>
-            </w:r>
-          </w:p>
-        </w:tc>
-        <w:tc>
-          <w:tcPr>
-            <w:tcW w:type="dxa" w:w="4535"/>
-          </w:tcPr>
-          <w:p>
-            <w:pPr>
-              <w:spacing w:after="40"/>
-              <w:jc w:val="left"/>
-            </w:pPr>
-            <w:r/>
-            <w:r>
-              <w:rPr>
-                <w:rFonts w:ascii="Times New Roman" w:hAnsi="Times New Roman" w:eastAsia="Times New Roman"/>
-                <w:b w:val="0"/>
-                <w:i w:val="0"/>
-                <w:sz w:val="21"/>
-              </w:rPr>
-              <w:t>Trái văn phong khoa học và quy tắc biên tập đã thống nhất.</w:t>
-            </w:r>
-          </w:p>
-        </w:tc>
-        <w:tc>
-          <w:tcPr>
-            <w:tcW w:type="dxa" w:w="1247"/>
-          </w:tcPr>
-          <w:p>
-            <w:pPr>
-              <w:spacing w:after="40"/>
-              <w:jc w:val="center"/>
-            </w:pPr>
-            <w:r/>
-            <w:r>
-              <w:rPr>
-                <w:rFonts w:ascii="Times New Roman" w:hAnsi="Times New Roman" w:eastAsia="Times New Roman"/>
-                <w:b/>
-                <w:i w:val="0"/>
-                <w:color w:val="595959"/>
-                <w:sz w:val="21"/>
-              </w:rPr>
-              <w:t>C - Hình thức</w:t>
-            </w:r>
-          </w:p>
-        </w:tc>
-        <w:tc>
-          <w:tcPr>
-            <w:tcW w:type="dxa" w:w="2835"/>
-          </w:tcPr>
-          <w:p>
-            <w:pPr>
-              <w:spacing w:after="40"/>
-              <w:jc w:val="left"/>
-            </w:pPr>
-            <w:r/>
-            <w:r>
-              <w:rPr>
-                <w:rFonts w:ascii="Times New Roman" w:hAnsi="Times New Roman" w:eastAsia="Times New Roman"/>
-                <w:b w:val="0"/>
-                <w:i w:val="0"/>
-                <w:sz w:val="21"/>
-              </w:rPr>
-              <w:t>Thay bằng diễn đạt trung tính.</w:t>
+              <w:t>Bổ sung danh sách 16 chỉ tiêu ở Chương 1 hoặc sửa dẫn chiếu.</w:t>
             </w:r>
           </w:p>
         </w:tc>
@@ -7372,7 +6598,7 @@
           <w:i/>
           <w:sz w:val="24"/>
         </w:rPr>
-        <w:t>Cột thông tin đúng lấy từ bản PDF (khi có) và danh mục đã kiểm chứng trong bản Bao_cao_toan_van_de_tai_khung_moi.docx.</w:t>
+        <w:t>Cột thông tin đúng lấy từ bản PDF (khi có) và tệp Zotero trong thư mục đề tài.</w:t>
       </w:r>
     </w:p>
     <w:tbl>
@@ -8576,13 +7802,12 @@
           <w:i w:val="0"/>
           <w:sz w:val="26"/>
         </w:rPr>
-        <w:t>5. Hướng xử lý đề xuất</w:t>
+        <w:t>5. Văn bản cần bổ sung</w:t>
       </w:r>
     </w:p>
     <w:p>
       <w:pPr>
-        <w:spacing w:before="0" w:after="60" w:line="276" w:lineRule="auto"/>
-        <w:ind w:left="340"/>
+        <w:spacing w:before="0" w:after="120" w:line="276" w:lineRule="auto"/>
         <w:jc w:val="both"/>
       </w:pPr>
       <w:r>
@@ -8592,39 +7817,7 @@
           <w:i w:val="0"/>
           <w:sz w:val="26"/>
         </w:rPr>
-        <w:t>- Cách 1, khuyến nghị: lấy bản Bao_cao_toan_van_de_tai_khung_moi.docx (đã đối chiếu nguồn, đúng khung đã chốt) làm nền; bổ sung từ bản tải lên những phần có giá trị sau khi sửa, như phân tích chênh lệch giữa 30% sau chi phí của điểm b Điều 36 và mức 15% của Điều 135, kế hoạch thí điểm sàng lọc và bộ chỉ số theo dõi.</w:t>
-      </w:r>
-    </w:p>
-    <w:p>
-      <w:pPr>
-        <w:spacing w:before="0" w:after="60" w:line="276" w:lineRule="auto"/>
-        <w:ind w:left="340"/>
-        <w:jc w:val="both"/>
-      </w:pPr>
-      <w:r>
-        <w:rPr>
-          <w:rFonts w:ascii="Times New Roman" w:hAnsi="Times New Roman" w:eastAsia="Times New Roman"/>
-          <w:b w:val="0"/>
-          <w:i w:val="0"/>
-          <w:sz w:val="26"/>
-        </w:rPr>
-        <w:t>- Cách 2: sửa trực tiếp bản tải lên theo Bảng 1 và Bảng 2, thay danh mục tài liệu tham khảo, thay hình vẽ bằng ký tự bằng biểu đồ từ bộ dữ liệu đã chuẩn hóa, đưa thân bài về đúng khung.</w:t>
-      </w:r>
-    </w:p>
-    <w:p>
-      <w:pPr>
-        <w:spacing w:before="0" w:after="60" w:line="276" w:lineRule="auto"/>
-        <w:ind w:left="340"/>
-        <w:jc w:val="both"/>
-      </w:pPr>
-      <w:r>
-        <w:rPr>
-          <w:rFonts w:ascii="Times New Roman" w:hAnsi="Times New Roman" w:eastAsia="Times New Roman"/>
-          <w:b w:val="0"/>
-          <w:i w:val="0"/>
-          <w:sz w:val="26"/>
-        </w:rPr>
-        <w:t>- Dù chọn cách nào, cần bổ sung văn bản gốc cho các nội dung chưa có nguồn: hai hợp đồng sách, Điều lệ Quỹ Ngô Xuân Độ, quy định tỷ lệ trùng lặp, quyết định thành lập Trường, tên các trung tâm ở Hình 2.3.</w:t>
+        <w:t>Các nội dung sau chưa có văn bản gốc trong hồ sơ; cần bổ sung để giữ lại, nếu không thì bỏ: hai hợp đồng chuyển giao quyền sử dụng sách; Điều lệ Quỹ Học bổng sau tiến sĩ Ngô Xuân Độ; quy định về tỷ lệ trùng lặp; quyết định thành lập Trường; tên các đơn vị ở Hình 2.3; bản gốc các bài của Maresova et al., Öztürk, Phạm và Nguyễn (2018), Lê và Nguyễn (2019) để kiểm tra các con số được dẫn.</w:t>
       </w:r>
     </w:p>
     <w:sectPr>

</xml_diff>

<commit_message>
Cập nhật rà soát tài liệu tham khảo theo tra cứu nhà xuất bản
Öztürk (2026) khảo sát 96 tư vấn viên là đúng; DOI đúng của Bstieler et al. là 10.1111/jpim.12242; Holgersson (2021) do European Commission phát hành; Bulsara & Vaghela đăng trên Asia-Pacific Tech Monitor (APCTT).

Co-Authored-By: Claude Opus 5.5 <noreply@anthropic.com>
Claude-Session: https://claude.ai/code/session_01ThGArqDrUUsqC1zG1BQvVL
</commit_message>
<xml_diff>
--- a/Ban_cuoi/Ban_hoan_thien_03-10-2026/Bao_cao_ra_soat_liem_chinh_toan_van.docx
+++ b/Ban_cuoi/Ban_hoan_thien_03-10-2026/Bao_cao_ra_soat_liem_chinh_toan_van.docx
@@ -6075,7 +6075,7 @@
                 <w:i w:val="0"/>
                 <w:sz w:val="21"/>
               </w:rPr>
-              <w:t>Maresova et al. tổng quan 22 công trình, phân loại theo bốn trụ cột; Öztürk khảo sát 96 chuyên gia; Phạm và Nguyễn (2018) nêu tỷ lệ 50% - 70% doanh thu cấp phép cho tác giả; Lê và Nguyễn (2019) đề xuất mô hình 5 bước.</w:t>
+              <w:t>Maresova et al. tổng quan 22 công trình, phân loại theo bốn trụ cột; Phạm và Nguyễn (2018) nêu tỷ lệ 50% - 70% doanh thu cấp phép cho tác giả; Lê và Nguyễn (2019) đề xuất mô hình 5 bước.</w:t>
             </w:r>
           </w:p>
         </w:tc>
@@ -6096,7 +6096,7 @@
                 <w:i w:val="0"/>
                 <w:sz w:val="21"/>
               </w:rPr>
-              <w:t>Thư mục không có bản gốc của các bài này nên chưa kiểm chứng được các con số. Danh mục cuối còn ghi Phạm và Nguyễn (2018) về Đại học Bách khoa Hà Nội, trái với chính Mở đầu ghi Đại học Thanh Hoa.</w:t>
+              <w:t>Thư mục không có bản gốc của các bài này nên chưa kiểm chứng được các con số. (Số liệu Öztürk khảo sát 96 tư vấn viên sở hữu công nghiệp là đúng theo trang Zenodo của bài.) Danh mục cuối còn ghi Phạm và Nguyễn (2018) về Đại học Bách khoa Hà Nội, trái với chính Mở đầu ghi Đại học Thanh Hoa.</w:t>
             </w:r>
           </w:p>
         </w:tc>
@@ -6598,7 +6598,7 @@
           <w:i/>
           <w:sz w:val="24"/>
         </w:rPr>
-        <w:t>Cột thông tin đúng lấy từ bản PDF (khi có) và tệp Zotero trong thư mục đề tài.</w:t>
+        <w:t>Cột thông tin đúng lấy từ bản PDF (khi có), tệp Zotero trong thư mục đề tài và trang của nhà xuất bản (tra cứu ngày 04/10/2026).</w:t>
       </w:r>
     </w:p>
     <w:tbl>
@@ -7308,7 +7308,7 @@
                 <w:i w:val="0"/>
                 <w:sz w:val="21"/>
               </w:rPr>
-              <w:t>Tên bài rút gọn; trang 100-112</w:t>
+              <w:t>Tên bài rút gọn; trang 100-112; danh mục ở Mở đầu ghi DOI 10.1111/jpim.12244</w:t>
             </w:r>
           </w:p>
         </w:tc>
@@ -7329,7 +7329,7 @@
                 <w:i w:val="0"/>
                 <w:sz w:val="21"/>
               </w:rPr>
-              <w:t>... US biotechnology industry: IP policies, shared governance, and champions; 32(1), 111-121</w:t>
+              <w:t>... U.S. biotechnology industry: IP policies, shared governance, and champions; 32(1), 111-121; DOI đúng 10.1111/jpim.12242 (trang Wiley)</w:t>
             </w:r>
           </w:p>
         </w:tc>
@@ -7373,7 +7373,7 @@
                 <w:i w:val="0"/>
                 <w:sz w:val="21"/>
               </w:rPr>
-              <w:t>International Journal of Innovation Studies, 9(2), 145-159</w:t>
+              <w:t>International Journal of Innovation Studies, 9(2), 145-159 (danh mục ở Mở đầu ghi Tech Monitor, WIPO)</w:t>
             </w:r>
           </w:p>
         </w:tc>
@@ -7394,7 +7394,7 @@
                 <w:i w:val="0"/>
                 <w:sz w:val="21"/>
               </w:rPr>
-              <w:t>Tech Monitor, WIPO, 38-43</w:t>
+              <w:t>Asia-Pacific Tech Monitor, 42(2), tháng 4 - 6/2025, do APCTT (ESCAP) xuất bản, không phải WIPO</w:t>
             </w:r>
           </w:p>
         </w:tc>
@@ -7438,7 +7438,7 @@
                 <w:i w:val="0"/>
                 <w:sz w:val="21"/>
               </w:rPr>
-              <w:t>European Journal of Innovation Management, 24(5), 1421-1440</w:t>
+              <w:t>European Journal of Innovation Management, 24(5), 1421-1440 (danh mục ở Mở đầu ghi European Patent Office)</w:t>
             </w:r>
           </w:p>
         </w:tc>
@@ -7459,7 +7459,7 @@
                 <w:i w:val="0"/>
                 <w:sz w:val="21"/>
               </w:rPr>
-              <w:t>Báo cáo của European Patent Office / Chalmers University</w:t>
+              <w:t>Báo cáo của European Commission, Directorate-General for Research and Innovation; tác giả hoàn thành tháng 10/2021, phát hành ngày 02/3/2022</w:t>
             </w:r>
           </w:p>
         </w:tc>
@@ -7817,7 +7817,7 @@
           <w:i w:val="0"/>
           <w:sz w:val="26"/>
         </w:rPr>
-        <w:t>Các nội dung sau chưa có văn bản gốc trong hồ sơ; cần bổ sung để giữ lại, nếu không thì bỏ: hai hợp đồng chuyển giao quyền sử dụng sách; Điều lệ Quỹ Học bổng sau tiến sĩ Ngô Xuân Độ; quy định về tỷ lệ trùng lặp; quyết định thành lập Trường; tên các đơn vị ở Hình 2.3; bản gốc các bài của Maresova et al., Öztürk, Phạm và Nguyễn (2018), Lê và Nguyễn (2019) để kiểm tra các con số được dẫn.</w:t>
+        <w:t>Các nội dung sau chưa có văn bản gốc trong hồ sơ; cần bổ sung để giữ lại, nếu không thì bỏ: hai hợp đồng chuyển giao quyền sử dụng sách; Điều lệ Quỹ Học bổng sau tiến sĩ Ngô Xuân Độ; quy định về tỷ lệ trùng lặp; quyết định thành lập Trường; tên các đơn vị ở Hình 2.3; bản gốc các bài của Maresova et al., Phạm và Nguyễn (2018), Lê và Nguyễn (2019) để kiểm tra các con số được dẫn.</w:t>
       </w:r>
     </w:p>
     <w:sectPr>

</xml_diff>

<commit_message>
Rà soát: bỏ nhận xét tên tác giả Việt vì tệp Zotero đã ghi đủ họ tên
Co-Authored-By: Claude Opus 5.5 <noreply@anthropic.com>
Claude-Session: https://claude.ai/code/session_01ThGArqDrUUsqC1zG1BQvVL
</commit_message>
<xml_diff>
--- a/Ban_cuoi/Ban_hoan_thien_03-10-2026/Bao_cao_ra_soat_liem_chinh_toan_van.docx
+++ b/Ban_cuoi/Ban_hoan_thien_03-10-2026/Bao_cao_ra_soat_liem_chinh_toan_van.docx
@@ -104,7 +104,7 @@
           <w:i w:val="0"/>
           <w:sz w:val="26"/>
         </w:rPr>
-        <w:t>Có 42 phát hiện, trong đó 16 lỗi mức A, 24 lỗi mức B và 2 lỗi mức C. Báo cáo chưa đủ điều kiện nộp nghiệm thu nếu chưa sửa các lỗi mức A. Bốn vấn đề chính:</w:t>
+        <w:t>Có 41 phát hiện, trong đó 16 lỗi mức A, 23 lỗi mức B và 2 lỗi mức C. Báo cáo chưa đủ điều kiện nộp nghiệm thu nếu chưa sửa các lỗi mức A. Bốn vấn đề chính:</w:t>
       </w:r>
     </w:p>
     <w:p>
@@ -6144,135 +6144,6 @@
           </w:p>
         </w:tc>
       </w:tr>
-      <w:tr>
-        <w:tc>
-          <w:tcPr>
-            <w:tcW w:type="dxa" w:w="737"/>
-          </w:tcPr>
-          <w:p>
-            <w:pPr>
-              <w:spacing w:after="40"/>
-              <w:jc w:val="center"/>
-            </w:pPr>
-            <w:r/>
-            <w:r>
-              <w:rPr>
-                <w:rFonts w:ascii="Times New Roman" w:hAnsi="Times New Roman" w:eastAsia="Times New Roman"/>
-                <w:b w:val="0"/>
-                <w:i w:val="0"/>
-                <w:sz w:val="21"/>
-              </w:rPr>
-              <w:t>41</w:t>
-            </w:r>
-          </w:p>
-        </w:tc>
-        <w:tc>
-          <w:tcPr>
-            <w:tcW w:type="dxa" w:w="1701"/>
-          </w:tcPr>
-          <w:p>
-            <w:pPr>
-              <w:spacing w:after="40"/>
-              <w:jc w:val="left"/>
-            </w:pPr>
-            <w:r/>
-            <w:r>
-              <w:rPr>
-                <w:rFonts w:ascii="Times New Roman" w:hAnsi="Times New Roman" w:eastAsia="Times New Roman"/>
-                <w:b w:val="0"/>
-                <w:i w:val="0"/>
-                <w:sz w:val="21"/>
-              </w:rPr>
-              <w:t>Mở đầu, Chương 1</w:t>
-            </w:r>
-          </w:p>
-        </w:tc>
-        <w:tc>
-          <w:tcPr>
-            <w:tcW w:type="dxa" w:w="3515"/>
-          </w:tcPr>
-          <w:p>
-            <w:pPr>
-              <w:spacing w:after="40"/>
-              <w:jc w:val="left"/>
-            </w:pPr>
-            <w:r/>
-            <w:r>
-              <w:rPr>
-                <w:rFonts w:ascii="Times New Roman" w:hAnsi="Times New Roman" w:eastAsia="Times New Roman"/>
-                <w:b w:val="0"/>
-                <w:i w:val="0"/>
-                <w:sz w:val="21"/>
-              </w:rPr>
-              <w:t>Viết đầy đủ tên tác giả Việt: Lê Thị Thu Hà và Nguyễn Thành Khang; Phạm Thúy Hằng; Lê Thị Thanh Tâm và Hoàng Đình Thái; Phạm Thị Thúy Hằng và Nguyễn Thanh Hùng.</w:t>
-            </w:r>
-          </w:p>
-        </w:tc>
-        <w:tc>
-          <w:tcPr>
-            <w:tcW w:type="dxa" w:w="4535"/>
-          </w:tcPr>
-          <w:p>
-            <w:pPr>
-              <w:spacing w:after="40"/>
-              <w:jc w:val="left"/>
-            </w:pPr>
-            <w:r/>
-            <w:r>
-              <w:rPr>
-                <w:rFonts w:ascii="Times New Roman" w:hAnsi="Times New Roman" w:eastAsia="Times New Roman"/>
-                <w:b w:val="0"/>
-                <w:i w:val="0"/>
-                <w:sz w:val="21"/>
-              </w:rPr>
-              <w:t>Danh mục chỉ có chữ viết tắt (Lê, T. T. H.; Phạm, T. H.); thư mục không có bản gốc. Tên đầy đủ có thể là suy đoán.</w:t>
-            </w:r>
-          </w:p>
-        </w:tc>
-        <w:tc>
-          <w:tcPr>
-            <w:tcW w:type="dxa" w:w="1247"/>
-          </w:tcPr>
-          <w:p>
-            <w:pPr>
-              <w:spacing w:after="40"/>
-              <w:jc w:val="center"/>
-            </w:pPr>
-            <w:r/>
-            <w:r>
-              <w:rPr>
-                <w:rFonts w:ascii="Times New Roman" w:hAnsi="Times New Roman" w:eastAsia="Times New Roman"/>
-                <w:b/>
-                <w:i w:val="0"/>
-                <w:color w:val="B45F06"/>
-                <w:sz w:val="21"/>
-              </w:rPr>
-              <w:t>B - Cần sửa</w:t>
-            </w:r>
-          </w:p>
-        </w:tc>
-        <w:tc>
-          <w:tcPr>
-            <w:tcW w:type="dxa" w:w="2835"/>
-          </w:tcPr>
-          <w:p>
-            <w:pPr>
-              <w:spacing w:after="40"/>
-              <w:jc w:val="left"/>
-            </w:pPr>
-            <w:r/>
-            <w:r>
-              <w:rPr>
-                <w:rFonts w:ascii="Times New Roman" w:hAnsi="Times New Roman" w:eastAsia="Times New Roman"/>
-                <w:b w:val="0"/>
-                <w:i w:val="0"/>
-                <w:sz w:val="21"/>
-              </w:rPr>
-              <w:t>Dùng họ và năm theo APA, ví dụ (Lê &amp; Nguyễn, 2019), trừ khi đã kiểm tra tên trên bài gốc.</w:t>
-            </w:r>
-          </w:p>
-        </w:tc>
-      </w:tr>
     </w:tbl>
     <w:p>
       <w:pPr>
@@ -6459,7 +6330,7 @@
                 <w:i w:val="0"/>
                 <w:sz w:val="21"/>
               </w:rPr>
-              <w:t>42</w:t>
+              <w:t>41</w:t>
             </w:r>
           </w:p>
         </w:tc>

</xml_diff>

<commit_message>
Rà soát: sửa phát hiện về cơ cấu tổ chức theo xác nhận của chủ nhiệm đề tài
Mỗi viện có Phòng Học vụ và Hợp tác đối ngoại, Phòng Công nghệ, Đổi mới sáng tạo và Khởi nghiệp; không có Trung tâm Đào tạo và Chuyển giao công nghệ, Viện Quản trị và Sáng tạo số; Trung tâm Tuyển sinh không tham gia quản lý tài sản trí tuệ.

Co-Authored-By: Claude Opus 5.5 <noreply@anthropic.com>
Claude-Session: https://claude.ai/code/session_01ThGArqDrUUsqC1zG1BQvVL
</commit_message>
<xml_diff>
--- a/Ban_cuoi/Ban_hoan_thien_03-10-2026/Bao_cao_ra_soat_liem_chinh_toan_van.docx
+++ b/Ban_cuoi/Ban_hoan_thien_03-10-2026/Bao_cao_ra_soat_liem_chinh_toan_van.docx
@@ -104,7 +104,7 @@
           <w:i w:val="0"/>
           <w:sz w:val="26"/>
         </w:rPr>
-        <w:t>Có 41 phát hiện, trong đó 16 lỗi mức A, 23 lỗi mức B và 2 lỗi mức C. Báo cáo chưa đủ điều kiện nộp nghiệm thu nếu chưa sửa các lỗi mức A. Bốn vấn đề chính:</w:t>
+        <w:t>Có 43 phát hiện, trong đó 18 lỗi mức A, 23 lỗi mức B và 2 lỗi mức C. Báo cáo chưa đủ điều kiện nộp nghiệm thu nếu chưa sửa các lỗi mức A. Bốn vấn đề chính:</w:t>
       </w:r>
     </w:p>
     <w:p>
@@ -4983,7 +4983,7 @@
                 <w:i w:val="0"/>
                 <w:sz w:val="21"/>
               </w:rPr>
-              <w:t>Hình 2.3; giải pháp 3.2.3, 3.2.4</w:t>
+              <w:t>Hình 2.3; 2.1.2; 2.3.2 (ý Ba là); Bảng 3.1 (W3); Bảng 3.2 (WT); Tiểu kết Chương 2; Kết luận; Kiến nghị</w:t>
             </w:r>
           </w:p>
         </w:tc>
@@ -5004,7 +5004,7 @@
                 <w:i w:val="0"/>
                 <w:sz w:val="21"/>
               </w:rPr>
-              <w:t>Đầu mối Trung tâm Đào tạo và Chuyển giao công nghệ, Viện Quản trị và Sáng tạo số; Trung tâm Công nghệ thông tin chủ trì hoặc phối hợp.</w:t>
+              <w:t>Công tác quản lý tài sản trí tuệ bị phân mảnh qua bốn đầu mối: Phòng KHCN, Bộ phận Pháp chế, Trung tâm Đào tạo và Chuyển giao công nghệ, Viện Quản trị và Sáng tạo số.</w:t>
             </w:r>
           </w:p>
         </w:tc>
@@ -5025,7 +5025,7 @@
                 <w:i w:val="0"/>
                 <w:sz w:val="21"/>
               </w:rPr>
-              <w:t>Các đơn vị này không có trong cơ cấu tổ chức ở Bảng 2.1 và danh sách nhân sự năm 2026.</w:t>
+              <w:t>Theo xác nhận của chủ nhiệm đề tài (04/10/2026), Trường không có Trung tâm Đào tạo và Chuyển giao công nghệ và Viện Quản trị và Sáng tạo số; hai đơn vị này cũng không có trong cơ cấu ở Bảng 2.1 và danh sách nhân sự năm 2026. Cơ cấu thực tế: mỗi viện có Phòng Học vụ và Hợp tác đối ngoại và Phòng Công nghệ, Đổi mới sáng tạo và Khởi nghiệp. Báo cáo không nhắc tới các Phòng Công nghệ, Đổi mới sáng tạo và Khởi nghiệp, là đầu mối gần nhất với nơi tạo ra sản phẩm.</w:t>
             </w:r>
           </w:p>
         </w:tc>
@@ -5044,6 +5044,264 @@
                 <w:rFonts w:ascii="Times New Roman" w:hAnsi="Times New Roman" w:eastAsia="Times New Roman"/>
                 <w:b/>
                 <w:i w:val="0"/>
+                <w:color w:val="C00000"/>
+                <w:sz w:val="21"/>
+              </w:rPr>
+              <w:t>A - Phải sửa trước khi nộp</w:t>
+            </w:r>
+          </w:p>
+        </w:tc>
+        <w:tc>
+          <w:tcPr>
+            <w:tcW w:type="dxa" w:w="2835"/>
+          </w:tcPr>
+          <w:p>
+            <w:pPr>
+              <w:spacing w:after="40"/>
+              <w:jc w:val="left"/>
+            </w:pPr>
+            <w:r/>
+            <w:r>
+              <w:rPr>
+                <w:rFonts w:ascii="Times New Roman" w:hAnsi="Times New Roman" w:eastAsia="Times New Roman"/>
+                <w:b w:val="0"/>
+                <w:i w:val="0"/>
+                <w:sz w:val="21"/>
+              </w:rPr>
+              <w:t>Vẽ lại Hình 2.3 theo cơ cấu thực tế; viết lại nhận định về số đầu mối và sự phân mảnh ở mọi chỗ được nhắc lại.</w:t>
+            </w:r>
+          </w:p>
+        </w:tc>
+      </w:tr>
+      <w:tr>
+        <w:tc>
+          <w:tcPr>
+            <w:tcW w:type="dxa" w:w="737"/>
+          </w:tcPr>
+          <w:p>
+            <w:pPr>
+              <w:spacing w:after="40"/>
+              <w:jc w:val="center"/>
+            </w:pPr>
+            <w:r/>
+            <w:r>
+              <w:rPr>
+                <w:rFonts w:ascii="Times New Roman" w:hAnsi="Times New Roman" w:eastAsia="Times New Roman"/>
+                <w:b w:val="0"/>
+                <w:i w:val="0"/>
+                <w:sz w:val="21"/>
+              </w:rPr>
+              <w:t>34</w:t>
+            </w:r>
+          </w:p>
+        </w:tc>
+        <w:tc>
+          <w:tcPr>
+            <w:tcW w:type="dxa" w:w="1701"/>
+          </w:tcPr>
+          <w:p>
+            <w:pPr>
+              <w:spacing w:after="40"/>
+              <w:jc w:val="left"/>
+            </w:pPr>
+            <w:r/>
+            <w:r>
+              <w:rPr>
+                <w:rFonts w:ascii="Times New Roman" w:hAnsi="Times New Roman" w:eastAsia="Times New Roman"/>
+                <w:b w:val="0"/>
+                <w:i w:val="0"/>
+                <w:sz w:val="21"/>
+              </w:rPr>
+              <w:t>Giải pháp 3.2.3 (đơn vị chủ trì, danh mục công nghệ); Bảng 3.3; 3.2.4 (đơn vị phối hợp)</w:t>
+            </w:r>
+          </w:p>
+        </w:tc>
+        <w:tc>
+          <w:tcPr>
+            <w:tcW w:type="dxa" w:w="3515"/>
+          </w:tcPr>
+          <w:p>
+            <w:pPr>
+              <w:spacing w:after="40"/>
+              <w:jc w:val="left"/>
+            </w:pPr>
+            <w:r/>
+            <w:r>
+              <w:rPr>
+                <w:rFonts w:ascii="Times New Roman" w:hAnsi="Times New Roman" w:eastAsia="Times New Roman"/>
+                <w:b w:val="0"/>
+                <w:i w:val="0"/>
+                <w:sz w:val="21"/>
+              </w:rPr>
+              <w:t>Trung tâm Đào tạo và Chuyển giao công nghệ chủ trì giải pháp 3.2.3; Trung tâm Công nghệ thông tin, Trung tâm Quản trị thương hiệu phối hợp giải pháp 3.2.4.</w:t>
+            </w:r>
+          </w:p>
+        </w:tc>
+        <w:tc>
+          <w:tcPr>
+            <w:tcW w:type="dxa" w:w="4535"/>
+          </w:tcPr>
+          <w:p>
+            <w:pPr>
+              <w:spacing w:after="40"/>
+              <w:jc w:val="left"/>
+            </w:pPr>
+            <w:r/>
+            <w:r>
+              <w:rPr>
+                <w:rFonts w:ascii="Times New Roman" w:hAnsi="Times New Roman" w:eastAsia="Times New Roman"/>
+                <w:b w:val="0"/>
+                <w:i w:val="0"/>
+                <w:sz w:val="21"/>
+              </w:rPr>
+              <w:t>Trung tâm Đào tạo và Chuyển giao công nghệ không tồn tại. Trung tâm Tuyển sinh và Quản trị thương hiệu không tham gia quản lý tài sản trí tuệ (xác nhận của chủ nhiệm đề tài). Trung tâm Công nghệ thông tin không có trong cơ cấu ở Bảng 2.1.</w:t>
+            </w:r>
+          </w:p>
+        </w:tc>
+        <w:tc>
+          <w:tcPr>
+            <w:tcW w:type="dxa" w:w="1247"/>
+          </w:tcPr>
+          <w:p>
+            <w:pPr>
+              <w:spacing w:after="40"/>
+              <w:jc w:val="center"/>
+            </w:pPr>
+            <w:r/>
+            <w:r>
+              <w:rPr>
+                <w:rFonts w:ascii="Times New Roman" w:hAnsi="Times New Roman" w:eastAsia="Times New Roman"/>
+                <w:b/>
+                <w:i w:val="0"/>
+                <w:color w:val="C00000"/>
+                <w:sz w:val="21"/>
+              </w:rPr>
+              <w:t>A - Phải sửa trước khi nộp</w:t>
+            </w:r>
+          </w:p>
+        </w:tc>
+        <w:tc>
+          <w:tcPr>
+            <w:tcW w:type="dxa" w:w="2835"/>
+          </w:tcPr>
+          <w:p>
+            <w:pPr>
+              <w:spacing w:after="40"/>
+              <w:jc w:val="left"/>
+            </w:pPr>
+            <w:r/>
+            <w:r>
+              <w:rPr>
+                <w:rFonts w:ascii="Times New Roman" w:hAnsi="Times New Roman" w:eastAsia="Times New Roman"/>
+                <w:b w:val="0"/>
+                <w:i w:val="0"/>
+                <w:sz w:val="21"/>
+              </w:rPr>
+              <w:t>Giao chủ trì, phối hợp cho đơn vị có thật, ví dụ Phòng KHCN và các Phòng Công nghệ, Đổi mới sáng tạo và Khởi nghiệp của viện; kiểm tra tên đơn vị công nghệ thông tin.</w:t>
+            </w:r>
+          </w:p>
+        </w:tc>
+      </w:tr>
+      <w:tr>
+        <w:tc>
+          <w:tcPr>
+            <w:tcW w:type="dxa" w:w="737"/>
+          </w:tcPr>
+          <w:p>
+            <w:pPr>
+              <w:spacing w:after="40"/>
+              <w:jc w:val="center"/>
+            </w:pPr>
+            <w:r/>
+            <w:r>
+              <w:rPr>
+                <w:rFonts w:ascii="Times New Roman" w:hAnsi="Times New Roman" w:eastAsia="Times New Roman"/>
+                <w:b w:val="0"/>
+                <w:i w:val="0"/>
+                <w:sz w:val="21"/>
+              </w:rPr>
+              <w:t>35</w:t>
+            </w:r>
+          </w:p>
+        </w:tc>
+        <w:tc>
+          <w:tcPr>
+            <w:tcW w:type="dxa" w:w="1701"/>
+          </w:tcPr>
+          <w:p>
+            <w:pPr>
+              <w:spacing w:after="40"/>
+              <w:jc w:val="left"/>
+            </w:pPr>
+            <w:r/>
+            <w:r>
+              <w:rPr>
+                <w:rFonts w:ascii="Times New Roman" w:hAnsi="Times New Roman" w:eastAsia="Times New Roman"/>
+                <w:b w:val="0"/>
+                <w:i w:val="0"/>
+                <w:sz w:val="21"/>
+              </w:rPr>
+              <w:t>Mục 2.1.2</w:t>
+            </w:r>
+          </w:p>
+        </w:tc>
+        <w:tc>
+          <w:tcPr>
+            <w:tcW w:type="dxa" w:w="3515"/>
+          </w:tcPr>
+          <w:p>
+            <w:pPr>
+              <w:spacing w:after="40"/>
+              <w:jc w:val="left"/>
+            </w:pPr>
+            <w:r/>
+            <w:r>
+              <w:rPr>
+                <w:rFonts w:ascii="Times New Roman" w:hAnsi="Times New Roman" w:eastAsia="Times New Roman"/>
+                <w:b w:val="0"/>
+                <w:i w:val="0"/>
+                <w:sz w:val="21"/>
+              </w:rPr>
+              <w:t>Liệt kê Trung tâm Tuyển sinh và Quản trị thương hiệu trong khối tham mưu, quản lý chức năng của bộ máy quản lý và triển khai hoạt động khoa học công nghệ.</w:t>
+            </w:r>
+          </w:p>
+        </w:tc>
+        <w:tc>
+          <w:tcPr>
+            <w:tcW w:type="dxa" w:w="4535"/>
+          </w:tcPr>
+          <w:p>
+            <w:pPr>
+              <w:spacing w:after="40"/>
+              <w:jc w:val="left"/>
+            </w:pPr>
+            <w:r/>
+            <w:r>
+              <w:rPr>
+                <w:rFonts w:ascii="Times New Roman" w:hAnsi="Times New Roman" w:eastAsia="Times New Roman"/>
+                <w:b w:val="0"/>
+                <w:i w:val="0"/>
+                <w:sz w:val="21"/>
+              </w:rPr>
+              <w:t>Trung tâm Tuyển sinh không tham gia hoạt động quản lý tài sản trí tuệ (xác nhận của chủ nhiệm đề tài). Bảng 2.1 nêu đơn vị này chỉ để thống kê nhân lực thì không sai.</w:t>
+            </w:r>
+          </w:p>
+        </w:tc>
+        <w:tc>
+          <w:tcPr>
+            <w:tcW w:type="dxa" w:w="1247"/>
+          </w:tcPr>
+          <w:p>
+            <w:pPr>
+              <w:spacing w:after="40"/>
+              <w:jc w:val="center"/>
+            </w:pPr>
+            <w:r/>
+            <w:r>
+              <w:rPr>
+                <w:rFonts w:ascii="Times New Roman" w:hAnsi="Times New Roman" w:eastAsia="Times New Roman"/>
+                <w:b/>
+                <w:i w:val="0"/>
                 <w:color w:val="B45F06"/>
                 <w:sz w:val="21"/>
               </w:rPr>
@@ -5068,7 +5326,7 @@
                 <w:i w:val="0"/>
                 <w:sz w:val="21"/>
               </w:rPr>
-              <w:t>Kiểm tra tên đơn vị; dùng đúng tên trong quy chế tổ chức.</w:t>
+              <w:t>Bỏ đơn vị này khỏi danh sách đơn vị tham gia quản lý khoa học công nghệ và tài sản trí tuệ.</w:t>
             </w:r>
           </w:p>
         </w:tc>
@@ -5259,7 +5517,7 @@
                 <w:i w:val="0"/>
                 <w:sz w:val="21"/>
               </w:rPr>
-              <w:t>34</w:t>
+              <w:t>36</w:t>
             </w:r>
           </w:p>
         </w:tc>
@@ -5388,7 +5646,7 @@
                 <w:i w:val="0"/>
                 <w:sz w:val="21"/>
               </w:rPr>
-              <w:t>35</w:t>
+              <w:t>37</w:t>
             </w:r>
           </w:p>
         </w:tc>
@@ -5517,7 +5775,7 @@
                 <w:i w:val="0"/>
                 <w:sz w:val="21"/>
               </w:rPr>
-              <w:t>36</w:t>
+              <w:t>38</w:t>
             </w:r>
           </w:p>
         </w:tc>
@@ -5646,7 +5904,7 @@
                 <w:i w:val="0"/>
                 <w:sz w:val="21"/>
               </w:rPr>
-              <w:t>37</w:t>
+              <w:t>39</w:t>
             </w:r>
           </w:p>
         </w:tc>
@@ -5775,7 +6033,7 @@
                 <w:i w:val="0"/>
                 <w:sz w:val="21"/>
               </w:rPr>
-              <w:t>38</w:t>
+              <w:t>40</w:t>
             </w:r>
           </w:p>
         </w:tc>
@@ -5904,7 +6162,7 @@
                 <w:i w:val="0"/>
                 <w:sz w:val="21"/>
               </w:rPr>
-              <w:t>39</w:t>
+              <w:t>41</w:t>
             </w:r>
           </w:p>
         </w:tc>
@@ -6033,7 +6291,7 @@
                 <w:i w:val="0"/>
                 <w:sz w:val="21"/>
               </w:rPr>
-              <w:t>40</w:t>
+              <w:t>42</w:t>
             </w:r>
           </w:p>
         </w:tc>
@@ -6330,7 +6588,7 @@
                 <w:i w:val="0"/>
                 <w:sz w:val="21"/>
               </w:rPr>
-              <w:t>41</w:t>
+              <w:t>43</w:t>
             </w:r>
           </w:p>
         </w:tc>
@@ -7688,7 +7946,7 @@
           <w:i w:val="0"/>
           <w:sz w:val="26"/>
         </w:rPr>
-        <w:t>Các nội dung sau chưa có văn bản gốc trong hồ sơ; cần bổ sung để giữ lại, nếu không thì bỏ: hai hợp đồng chuyển giao quyền sử dụng sách; Điều lệ Quỹ Học bổng sau tiến sĩ Ngô Xuân Độ; quy định về tỷ lệ trùng lặp; quyết định thành lập Trường; tên các đơn vị ở Hình 2.3; bản gốc các bài của Maresova et al., Phạm và Nguyễn (2018), Lê và Nguyễn (2019) để kiểm tra các con số được dẫn.</w:t>
+        <w:t>Các nội dung sau chưa có văn bản gốc trong hồ sơ; cần bổ sung để giữ lại, nếu không thì bỏ: hai hợp đồng chuyển giao quyền sử dụng sách; Điều lệ Quỹ Học bổng sau tiến sĩ Ngô Xuân Độ; quy định về tỷ lệ trùng lặp; quyết định thành lập Trường; bản gốc các bài của Maresova et al., Phạm và Nguyễn (2018), Lê và Nguyễn (2019) để kiểm tra các con số được dẫn.</w:t>
       </w:r>
     </w:p>
     <w:sectPr>

</xml_diff>

<commit_message>
Rà soát: đối chiếu Nghị định 100/2026 và 10 bài báo mới bổ sung
Nghị định 100 không có quy định về quỹ của cơ sở giáo dục đại học; Phạm Thị Thúy Hằng (2018, 2019), Pandey, Öztürk, Holgersson bị gán sai một số nội dung; Lê và Hoàng, Holgersson và Aaboen, Bstieler khớp bản gốc.

Co-Authored-By: Claude Opus 5.5 <noreply@anthropic.com>
Claude-Session: https://claude.ai/code/session_01ThGArqDrUUsqC1zG1BQvVL
</commit_message>
<xml_diff>
--- a/Ban_cuoi/Ban_hoan_thien_03-10-2026/Bao_cao_ra_soat_liem_chinh_toan_van.docx
+++ b/Ban_cuoi/Ban_hoan_thien_03-10-2026/Bao_cao_ra_soat_liem_chinh_toan_van.docx
@@ -104,7 +104,7 @@
           <w:i w:val="0"/>
           <w:sz w:val="26"/>
         </w:rPr>
-        <w:t>Có 43 phát hiện, trong đó 18 lỗi mức A, 23 lỗi mức B và 2 lỗi mức C. Báo cáo chưa đủ điều kiện nộp nghiệm thu nếu chưa sửa các lỗi mức A. Bốn vấn đề chính:</w:t>
+        <w:t>Có 50 phát hiện, trong đó 20 lỗi mức A, 28 lỗi mức B và 2 lỗi mức C. Báo cáo chưa đủ điều kiện nộp nghiệm thu nếu chưa sửa các lỗi mức A. Bốn vấn đề chính:</w:t>
       </w:r>
     </w:p>
     <w:p>
@@ -168,7 +168,7 @@
           <w:i w:val="0"/>
           <w:sz w:val="26"/>
         </w:rPr>
-        <w:t>- Danh mục tài liệu tham khảo cuối sai thông tin xuất bản của 15 tài liệu và mâu thuẫn với danh mục ở Mở đầu; một bài báo bị gán cho sai tác giả (Rialti thay cho O'Dwyer).</w:t>
+        <w:t>- Danh mục tài liệu tham khảo cuối sai thông tin xuất bản của 18 tài liệu và mâu thuẫn với danh mục ở Mở đầu; một bài báo bị gán cho sai tác giả (Rialti thay cho O'Dwyer).</w:t>
       </w:r>
     </w:p>
     <w:p>
@@ -232,6 +232,22 @@
           <w:sz w:val="26"/>
         </w:rPr>
         <w:t>- Bảng 2.7: mã số, sản phẩm, nhóm quyền và ngày nghiệm thu khớp danh mục đề tài (trừ cột đơn vị, xem phát hiện số 30).</w:t>
+      </w:r>
+    </w:p>
+    <w:p>
+      <w:pPr>
+        <w:spacing w:before="0" w:after="60" w:line="276" w:lineRule="auto"/>
+        <w:ind w:left="340"/>
+        <w:jc w:val="both"/>
+      </w:pPr>
+      <w:r>
+        <w:rPr>
+          <w:rFonts w:ascii="Times New Roman" w:hAnsi="Times New Roman" w:eastAsia="Times New Roman"/>
+          <w:b w:val="0"/>
+          <w:i w:val="0"/>
+          <w:sz w:val="26"/>
+        </w:rPr>
+        <w:t>- Nội dung gán cho Lê và Hoàng (2021) (bộ phận chuyên trách, quy chế phân chia lợi nhuận), Holgersson và Aaboen (2019) (tiếp nhận bản khai báo sáng chế), Bstieler et al. (2015) (chính sách sở hữu trí tuệ linh hoạt, minh bạch gắn với niềm tin; khảo sát 105 hợp tác) khớp bản gốc; Öztürk (2026) khảo sát 96 tư vấn viên sở hữu công nghiệp.</w:t>
       </w:r>
     </w:p>
     <w:p>
@@ -2535,7 +2551,7 @@
                 <w:i w:val="0"/>
                 <w:sz w:val="21"/>
               </w:rPr>
-              <w:t>Nghị định số 100/2026/NĐ-CP ban hành ngày 31/3/2026, sửa đổi Nghị định số 65/2023/NĐ-CP về sở hữu công nghiệp (chính báo cáo cũng mô tả đúng như vậy ở Mục 1.2). Tên văn bản, ngày ban hành và nội dung gán cho nghị định này đều không đúng. Căn cứ cho phép quỹ chi đăng ký, bảo hộ, khai thác quyền sở hữu trí tuệ là điểm b khoản 2 Điều 66 Luật số 93/2025/QH15.</w:t>
+              <w:t>Theo văn bản gốc trong thư mục VBPL, Nghị định số 100/2026/NĐ-CP ban hành ngày 31/3/2026, sửa đổi Nghị định số 65/2023/NĐ-CP về sở hữu công nghiệp (chính báo cáo cũng mô tả đúng như vậy ở Mục 1.2). Toàn văn nghị định không có quy định nào về quỹ phát triển khoa học và công nghệ của cơ sở giáo dục đại học. Tên văn bản, ngày ban hành và nội dung gán cho nghị định này đều không đúng. Căn cứ cho phép quỹ chi đăng ký, bảo hộ, khai thác quyền sở hữu trí tuệ là điểm b khoản 2 Điều 66 Luật số 93/2025/QH15.</w:t>
             </w:r>
           </w:p>
         </w:tc>
@@ -5580,7 +5596,7 @@
                 <w:i w:val="0"/>
                 <w:sz w:val="21"/>
               </w:rPr>
-              <w:t>Đối chiếu bản PDF và tệp Zotero: danh mục ở cuối sai thông tin xuất bản của 15 tài liệu (chi tiết ở Bảng 2). Thông tin xuất bản sai khiến người đọc không truy xuất được tài liệu, nên là lỗi liêm chính.</w:t>
+              <w:t>Đối chiếu bản PDF và tệp Zotero: danh mục ở cuối sai thông tin xuất bản của 18 tài liệu (chi tiết ở Bảng 2). Thông tin xuất bản sai khiến người đọc không truy xuất được tài liệu, nên là lỗi liêm chính.</w:t>
             </w:r>
           </w:p>
         </w:tc>
@@ -6183,7 +6199,7 @@
                 <w:i w:val="0"/>
                 <w:sz w:val="21"/>
               </w:rPr>
-              <w:t>1.1.1</w:t>
+              <w:t>Mở đầu 2.2 (Thứ ba); 1.1.2 mục 5</w:t>
             </w:r>
           </w:p>
         </w:tc>
@@ -6204,7 +6220,7 @@
                 <w:i w:val="0"/>
                 <w:sz w:val="21"/>
               </w:rPr>
-              <w:t>Fisher (2001) và Guan (2014) chỉ ra tài sản trí tuệ là sự kết hợp hữu cơ giữa tính trừu tượng của ý tưởng và hình thức biểu hiện vật chất.</w:t>
+              <w:t>Holgersson (2021) và Öztürk (2026) chỉ ra việc ứng dụng phần mềm công nghệ thông tin để tự động hóa, quản lý toàn bộ chu trình sống của tài sản trí tuệ.</w:t>
             </w:r>
           </w:p>
         </w:tc>
@@ -6225,7 +6241,7 @@
                 <w:i w:val="0"/>
                 <w:sz w:val="21"/>
               </w:rPr>
-              <w:t>Chương của Guan (2014) có trong thư mục mở đầu bằng nhận định không có định nghĩa thống nhất về sở hữu trí tuệ; không thấy luận điểm như báo cáo nêu.</w:t>
+              <w:t>Đối chiếu bản PDF: báo cáo của Holgersson (khảo sát 21 trường đại học châu Âu) và bài của Öztürk đều không bàn về phần mềm quản lý vòng đời tài sản trí tuệ; phần mềm duy nhất Öztürk nhắc tới là SPSS dùng để xử lý số liệu.</w:t>
             </w:r>
           </w:p>
         </w:tc>
@@ -6268,7 +6284,7 @@
                 <w:i w:val="0"/>
                 <w:sz w:val="21"/>
               </w:rPr>
-              <w:t>Diễn đạt lại đúng luận điểm của nguồn.</w:t>
+              <w:t>Bỏ trích dẫn cho luận điểm này hoặc tìm nguồn khác.</w:t>
             </w:r>
           </w:p>
         </w:tc>
@@ -6312,7 +6328,7 @@
                 <w:i w:val="0"/>
                 <w:sz w:val="21"/>
               </w:rPr>
-              <w:t>Mở đầu 2.1, 2.2</w:t>
+              <w:t>Mở đầu 2.2 (Thứ nhất)</w:t>
             </w:r>
           </w:p>
         </w:tc>
@@ -6333,7 +6349,7 @@
                 <w:i w:val="0"/>
                 <w:sz w:val="21"/>
               </w:rPr>
-              <w:t>Maresova et al. tổng quan 22 công trình, phân loại theo bốn trụ cột; Phạm và Nguyễn (2018) nêu tỷ lệ 50% - 70% doanh thu cấp phép cho tác giả; Lê và Nguyễn (2019) đề xuất mô hình 5 bước.</w:t>
+              <w:t>Holgersson (2021) phân tích sự chuyển dịch mang tính lịch sử tại các đại học châu Âu từ quy chế quyền nhà sáng chế sang quy chế quyền sở hữu của đại học.</w:t>
             </w:r>
           </w:p>
         </w:tc>
@@ -6354,7 +6370,7 @@
                 <w:i w:val="0"/>
                 <w:sz w:val="21"/>
               </w:rPr>
-              <w:t>Thư mục không có bản gốc của các bài này nên chưa kiểm chứng được các con số. Con số 22 công trình và mô hình 5 bước đã có từ bản thuyết minh đề tài; tỷ lệ 50% - 70% chỉ thấy trong một bản nháp cũ, ghi là kinh nghiệm quốc tế, không gắn với Đại học Thanh Hoa. (Số liệu Öztürk khảo sát 96 tư vấn viên sở hữu công nghiệp là đúng theo trang Zenodo của bài.) Danh mục cuối còn ghi Phạm và Nguyễn (2018) về Đại học Bách khoa Hà Nội, trái với chính Mở đầu ghi Đại học Thanh Hoa.</w:t>
+              <w:t>Báo cáo của Holgersson là nghiên cứu thực nghiệm về thực tiễn quản lý sở hữu trí tuệ ở 21 trường; quy định miễn trừ cho giảng viên chỉ được nêu như một khác biệt giữa các nước, không phải phân tích quá trình chuyển dịch. Phần về các phương thức thương mại hóa (cấp phép, doanh nghiệp khởi nguồn, cấp phép mở) thì có trong báo cáo.</w:t>
             </w:r>
           </w:p>
         </w:tc>
@@ -6397,7 +6413,910 @@
                 <w:i w:val="0"/>
                 <w:sz w:val="21"/>
               </w:rPr>
-              <w:t>Kiểm tra bản gốc; chưa kiểm chứng được thì bỏ con số.</w:t>
+              <w:t>Diễn đạt lại đúng phạm vi của báo cáo.</w:t>
+            </w:r>
+          </w:p>
+        </w:tc>
+      </w:tr>
+      <w:tr>
+        <w:tc>
+          <w:tcPr>
+            <w:tcW w:type="dxa" w:w="737"/>
+          </w:tcPr>
+          <w:p>
+            <w:pPr>
+              <w:spacing w:after="40"/>
+              <w:jc w:val="center"/>
+            </w:pPr>
+            <w:r/>
+            <w:r>
+              <w:rPr>
+                <w:rFonts w:ascii="Times New Roman" w:hAnsi="Times New Roman" w:eastAsia="Times New Roman"/>
+                <w:b w:val="0"/>
+                <w:i w:val="0"/>
+                <w:sz w:val="21"/>
+              </w:rPr>
+              <w:t>43</w:t>
+            </w:r>
+          </w:p>
+        </w:tc>
+        <w:tc>
+          <w:tcPr>
+            <w:tcW w:type="dxa" w:w="1701"/>
+          </w:tcPr>
+          <w:p>
+            <w:pPr>
+              <w:spacing w:after="40"/>
+              <w:jc w:val="left"/>
+            </w:pPr>
+            <w:r/>
+            <w:r>
+              <w:rPr>
+                <w:rFonts w:ascii="Times New Roman" w:hAnsi="Times New Roman" w:eastAsia="Times New Roman"/>
+                <w:b w:val="0"/>
+                <w:i w:val="0"/>
+                <w:sz w:val="21"/>
+              </w:rPr>
+              <w:t>Mở đầu 2.2 (Thứ hai)</w:t>
+            </w:r>
+          </w:p>
+        </w:tc>
+        <w:tc>
+          <w:tcPr>
+            <w:tcW w:type="dxa" w:w="3515"/>
+          </w:tcPr>
+          <w:p>
+            <w:pPr>
+              <w:spacing w:after="40"/>
+              <w:jc w:val="left"/>
+            </w:pPr>
+            <w:r/>
+            <w:r>
+              <w:rPr>
+                <w:rFonts w:ascii="Times New Roman" w:hAnsi="Times New Roman" w:eastAsia="Times New Roman"/>
+                <w:b w:val="0"/>
+                <w:i w:val="0"/>
+                <w:sz w:val="21"/>
+              </w:rPr>
+              <w:t>Öztürk (2026) chứng minh văn phòng chuyển giao công nghệ đóng vai trò quyết định; rào cản lớn nhất là thiếu nhân sự có chứng chỉ chuyên môn sâu.</w:t>
+            </w:r>
+          </w:p>
+        </w:tc>
+        <w:tc>
+          <w:tcPr>
+            <w:tcW w:type="dxa" w:w="4535"/>
+          </w:tcPr>
+          <w:p>
+            <w:pPr>
+              <w:spacing w:after="40"/>
+              <w:jc w:val="left"/>
+            </w:pPr>
+            <w:r/>
+            <w:r>
+              <w:rPr>
+                <w:rFonts w:ascii="Times New Roman" w:hAnsi="Times New Roman" w:eastAsia="Times New Roman"/>
+                <w:b w:val="0"/>
+                <w:i w:val="0"/>
+                <w:sz w:val="21"/>
+              </w:rPr>
+              <w:t>Bài gốc kết luận văn phòng chuyển giao công nghệ có vai trò quan trọng; các văn phòng gặp khó khăn trong tìm nhân sự có năng lực và trong thương mại hóa; số giao dịch thay đổi theo chứng chỉ nghề nghiệp của nhân viên. Bài không xếp hạng rào cản. Con số 96 người trả lời là đúng.</w:t>
+            </w:r>
+          </w:p>
+        </w:tc>
+        <w:tc>
+          <w:tcPr>
+            <w:tcW w:type="dxa" w:w="1247"/>
+          </w:tcPr>
+          <w:p>
+            <w:pPr>
+              <w:spacing w:after="40"/>
+              <w:jc w:val="center"/>
+            </w:pPr>
+            <w:r/>
+            <w:r>
+              <w:rPr>
+                <w:rFonts w:ascii="Times New Roman" w:hAnsi="Times New Roman" w:eastAsia="Times New Roman"/>
+                <w:b/>
+                <w:i w:val="0"/>
+                <w:color w:val="B45F06"/>
+                <w:sz w:val="21"/>
+              </w:rPr>
+              <w:t>B - Cần sửa</w:t>
+            </w:r>
+          </w:p>
+        </w:tc>
+        <w:tc>
+          <w:tcPr>
+            <w:tcW w:type="dxa" w:w="2835"/>
+          </w:tcPr>
+          <w:p>
+            <w:pPr>
+              <w:spacing w:after="40"/>
+              <w:jc w:val="left"/>
+            </w:pPr>
+            <w:r/>
+            <w:r>
+              <w:rPr>
+                <w:rFonts w:ascii="Times New Roman" w:hAnsi="Times New Roman" w:eastAsia="Times New Roman"/>
+                <w:b w:val="0"/>
+                <w:i w:val="0"/>
+                <w:sz w:val="21"/>
+              </w:rPr>
+              <w:t>Sửa thành: có vai trò quan trọng; gặp khó khăn về nhân sự có năng lực và thương mại hóa.</w:t>
+            </w:r>
+          </w:p>
+        </w:tc>
+      </w:tr>
+      <w:tr>
+        <w:tc>
+          <w:tcPr>
+            <w:tcW w:type="dxa" w:w="737"/>
+          </w:tcPr>
+          <w:p>
+            <w:pPr>
+              <w:spacing w:after="40"/>
+              <w:jc w:val="center"/>
+            </w:pPr>
+            <w:r/>
+            <w:r>
+              <w:rPr>
+                <w:rFonts w:ascii="Times New Roman" w:hAnsi="Times New Roman" w:eastAsia="Times New Roman"/>
+                <w:b w:val="0"/>
+                <w:i w:val="0"/>
+                <w:sz w:val="21"/>
+              </w:rPr>
+              <w:t>44</w:t>
+            </w:r>
+          </w:p>
+        </w:tc>
+        <w:tc>
+          <w:tcPr>
+            <w:tcW w:type="dxa" w:w="1701"/>
+          </w:tcPr>
+          <w:p>
+            <w:pPr>
+              <w:spacing w:after="40"/>
+              <w:jc w:val="left"/>
+            </w:pPr>
+            <w:r/>
+            <w:r>
+              <w:rPr>
+                <w:rFonts w:ascii="Times New Roman" w:hAnsi="Times New Roman" w:eastAsia="Times New Roman"/>
+                <w:b w:val="0"/>
+                <w:i w:val="0"/>
+                <w:sz w:val="21"/>
+              </w:rPr>
+              <w:t>Mở đầu 2.2 (Thứ hai, Thứ ba); Bảng tiêu chí ở Mục 1.2</w:t>
+            </w:r>
+          </w:p>
+        </w:tc>
+        <w:tc>
+          <w:tcPr>
+            <w:tcW w:type="dxa" w:w="3515"/>
+          </w:tcPr>
+          <w:p>
+            <w:pPr>
+              <w:spacing w:after="40"/>
+              <w:jc w:val="left"/>
+            </w:pPr>
+            <w:r/>
+            <w:r>
+              <w:rPr>
+                <w:rFonts w:ascii="Times New Roman" w:hAnsi="Times New Roman" w:eastAsia="Times New Roman"/>
+                <w:b w:val="0"/>
+                <w:i w:val="0"/>
+                <w:sz w:val="21"/>
+              </w:rPr>
+              <w:t>Pandey et al. (2025) đề xuất kết hợp văn phòng chuyển giao với trung tâm ươm tạo, giảm thủ tục, định giá và phân chia doanh thu linh hoạt; Maresova et al. (2019) và Pandey et al. (2025) đề xuất hệ thống chỉ số (tỷ lệ đơn thành công, số hợp đồng, doanh thu, mức độ tuân thủ quy chế).</w:t>
+            </w:r>
+          </w:p>
+        </w:tc>
+        <w:tc>
+          <w:tcPr>
+            <w:tcW w:type="dxa" w:w="4535"/>
+          </w:tcPr>
+          <w:p>
+            <w:pPr>
+              <w:spacing w:after="40"/>
+              <w:jc w:val="left"/>
+            </w:pPr>
+            <w:r/>
+            <w:r>
+              <w:rPr>
+                <w:rFonts w:ascii="Times New Roman" w:hAnsi="Times New Roman" w:eastAsia="Times New Roman"/>
+                <w:b w:val="0"/>
+                <w:i w:val="0"/>
+                <w:sz w:val="21"/>
+              </w:rPr>
+              <w:t>Bài của Pandey et al. (khảo sát 32 cơ sở ở Ấn Độ) có nêu rào cản thủ tục quan liêu, nhưng không bàn về định giá, phân chia doanh thu hay hệ thống chỉ số; chính bài tự nêu giới hạn là không phân tích chỉ số tài chính. Nội dung về trung tâm ươm tạo, mô hình chia doanh thu và các chỉ số (số sáng chế, hợp tác, doanh thu cấp phép, số doanh nghiệp khởi nghiệp) có trong bài của Bulsara và Vaghela (2025).</w:t>
+            </w:r>
+          </w:p>
+        </w:tc>
+        <w:tc>
+          <w:tcPr>
+            <w:tcW w:type="dxa" w:w="1247"/>
+          </w:tcPr>
+          <w:p>
+            <w:pPr>
+              <w:spacing w:after="40"/>
+              <w:jc w:val="center"/>
+            </w:pPr>
+            <w:r/>
+            <w:r>
+              <w:rPr>
+                <w:rFonts w:ascii="Times New Roman" w:hAnsi="Times New Roman" w:eastAsia="Times New Roman"/>
+                <w:b/>
+                <w:i w:val="0"/>
+                <w:color w:val="B45F06"/>
+                <w:sz w:val="21"/>
+              </w:rPr>
+              <w:t>B - Cần sửa</w:t>
+            </w:r>
+          </w:p>
+        </w:tc>
+        <w:tc>
+          <w:tcPr>
+            <w:tcW w:type="dxa" w:w="2835"/>
+          </w:tcPr>
+          <w:p>
+            <w:pPr>
+              <w:spacing w:after="40"/>
+              <w:jc w:val="left"/>
+            </w:pPr>
+            <w:r/>
+            <w:r>
+              <w:rPr>
+                <w:rFonts w:ascii="Times New Roman" w:hAnsi="Times New Roman" w:eastAsia="Times New Roman"/>
+                <w:b w:val="0"/>
+                <w:i w:val="0"/>
+                <w:sz w:val="21"/>
+              </w:rPr>
+              <w:t>Gán các nội dung này cho Bulsara và Vaghela (2025); giữ Pandey et al. cho luận điểm về rào cản thủ tục, kinh phí và hợp tác với doanh nghiệp.</w:t>
+            </w:r>
+          </w:p>
+        </w:tc>
+      </w:tr>
+      <w:tr>
+        <w:tc>
+          <w:tcPr>
+            <w:tcW w:type="dxa" w:w="737"/>
+          </w:tcPr>
+          <w:p>
+            <w:pPr>
+              <w:spacing w:after="40"/>
+              <w:jc w:val="center"/>
+            </w:pPr>
+            <w:r/>
+            <w:r>
+              <w:rPr>
+                <w:rFonts w:ascii="Times New Roman" w:hAnsi="Times New Roman" w:eastAsia="Times New Roman"/>
+                <w:b w:val="0"/>
+                <w:i w:val="0"/>
+                <w:sz w:val="21"/>
+              </w:rPr>
+              <w:t>45</w:t>
+            </w:r>
+          </w:p>
+        </w:tc>
+        <w:tc>
+          <w:tcPr>
+            <w:tcW w:type="dxa" w:w="1701"/>
+          </w:tcPr>
+          <w:p>
+            <w:pPr>
+              <w:spacing w:after="40"/>
+              <w:jc w:val="left"/>
+            </w:pPr>
+            <w:r/>
+            <w:r>
+              <w:rPr>
+                <w:rFonts w:ascii="Times New Roman" w:hAnsi="Times New Roman" w:eastAsia="Times New Roman"/>
+                <w:b w:val="0"/>
+                <w:i w:val="0"/>
+                <w:sz w:val="21"/>
+              </w:rPr>
+              <w:t>Mở đầu 2.1 (Thứ nhất); 1.1.1; 1.2; 1.2.4</w:t>
+            </w:r>
+          </w:p>
+        </w:tc>
+        <w:tc>
+          <w:tcPr>
+            <w:tcW w:type="dxa" w:w="3515"/>
+          </w:tcPr>
+          <w:p>
+            <w:pPr>
+              <w:spacing w:after="40"/>
+              <w:jc w:val="left"/>
+            </w:pPr>
+            <w:r/>
+            <w:r>
+              <w:rPr>
+                <w:rFonts w:ascii="Times New Roman" w:hAnsi="Times New Roman" w:eastAsia="Times New Roman"/>
+                <w:b w:val="0"/>
+                <w:i w:val="0"/>
+                <w:sz w:val="21"/>
+              </w:rPr>
+              <w:t>Phạm Thúy Hằng (2019) xác định bốn nội dung quản lý cốt lõi: xây dựng thể chế quy chế nội bộ, tổ chức bộ máy, quản lý chu trình xác lập - đăng ký - khai thác, nâng cao nhận thức bảo vệ; bốn khâu được điều phối qua bốn chức năng quản lý (Phạm, 2019; Lê và Nguyễn, 2019); định nghĩa có chủ thể là Hội đồng trường, Ban Giám hiệu, đơn vị chuyên trách.</w:t>
+            </w:r>
+          </w:p>
+        </w:tc>
+        <w:tc>
+          <w:tcPr>
+            <w:tcW w:type="dxa" w:w="4535"/>
+          </w:tcPr>
+          <w:p>
+            <w:pPr>
+              <w:spacing w:after="40"/>
+              <w:jc w:val="left"/>
+            </w:pPr>
+            <w:r/>
+            <w:r>
+              <w:rPr>
+                <w:rFonts w:ascii="Times New Roman" w:hAnsi="Times New Roman" w:eastAsia="Times New Roman"/>
+                <w:b w:val="0"/>
+                <w:i w:val="0"/>
+                <w:sz w:val="21"/>
+              </w:rPr>
+              <w:t>Bài gốc (Tạp chí Khoa học Quản lý Giáo dục, số 02(22), 2019, tr. 20-28) do Phạm Thị Thúy Hằng viết, nêu bốn nội dung khác: quản lý hành chính sở hữu trí tuệ (phát hiện, khai báo, ghi nhận); quản lý xác lập và bảo vệ quyền; quản lý khai thác thương mại; quản lý môi trường và điều kiện hỗ trợ. Bài không nói về bốn chức năng quản lý. Định nghĩa gốc là tổng thể tác động có tổ chức, có mục đích của chủ thể quản lý trường đại học nhằm tạo lập, bảo hộ, bảo vệ, khai thác và sử dụng hiệu quả sở hữu trí tuệ, không liệt kê Hội đồng trường, Ban Giám hiệu.</w:t>
+            </w:r>
+          </w:p>
+        </w:tc>
+        <w:tc>
+          <w:tcPr>
+            <w:tcW w:type="dxa" w:w="1247"/>
+          </w:tcPr>
+          <w:p>
+            <w:pPr>
+              <w:spacing w:after="40"/>
+              <w:jc w:val="center"/>
+            </w:pPr>
+            <w:r/>
+            <w:r>
+              <w:rPr>
+                <w:rFonts w:ascii="Times New Roman" w:hAnsi="Times New Roman" w:eastAsia="Times New Roman"/>
+                <w:b/>
+                <w:i w:val="0"/>
+                <w:color w:val="C00000"/>
+                <w:sz w:val="21"/>
+              </w:rPr>
+              <w:t>A - Phải sửa trước khi nộp</w:t>
+            </w:r>
+          </w:p>
+        </w:tc>
+        <w:tc>
+          <w:tcPr>
+            <w:tcW w:type="dxa" w:w="2835"/>
+          </w:tcPr>
+          <w:p>
+            <w:pPr>
+              <w:spacing w:after="40"/>
+              <w:jc w:val="left"/>
+            </w:pPr>
+            <w:r/>
+            <w:r>
+              <w:rPr>
+                <w:rFonts w:ascii="Times New Roman" w:hAnsi="Times New Roman" w:eastAsia="Times New Roman"/>
+                <w:b w:val="0"/>
+                <w:i w:val="0"/>
+                <w:sz w:val="21"/>
+              </w:rPr>
+              <w:t>Sửa tên tác giả, bốn nội dung và định nghĩa theo bài gốc; bỏ trích dẫn cho bốn chức năng quản lý.</w:t>
+            </w:r>
+          </w:p>
+        </w:tc>
+      </w:tr>
+      <w:tr>
+        <w:tc>
+          <w:tcPr>
+            <w:tcW w:type="dxa" w:w="737"/>
+          </w:tcPr>
+          <w:p>
+            <w:pPr>
+              <w:spacing w:after="40"/>
+              <w:jc w:val="center"/>
+            </w:pPr>
+            <w:r/>
+            <w:r>
+              <w:rPr>
+                <w:rFonts w:ascii="Times New Roman" w:hAnsi="Times New Roman" w:eastAsia="Times New Roman"/>
+                <w:b w:val="0"/>
+                <w:i w:val="0"/>
+                <w:sz w:val="21"/>
+              </w:rPr>
+              <w:t>46</w:t>
+            </w:r>
+          </w:p>
+        </w:tc>
+        <w:tc>
+          <w:tcPr>
+            <w:tcW w:type="dxa" w:w="1701"/>
+          </w:tcPr>
+          <w:p>
+            <w:pPr>
+              <w:spacing w:after="40"/>
+              <w:jc w:val="left"/>
+            </w:pPr>
+            <w:r/>
+            <w:r>
+              <w:rPr>
+                <w:rFonts w:ascii="Times New Roman" w:hAnsi="Times New Roman" w:eastAsia="Times New Roman"/>
+                <w:b w:val="0"/>
+                <w:i w:val="0"/>
+                <w:sz w:val="21"/>
+              </w:rPr>
+              <w:t>Mở đầu 2.1</w:t>
+            </w:r>
+          </w:p>
+        </w:tc>
+        <w:tc>
+          <w:tcPr>
+            <w:tcW w:type="dxa" w:w="3515"/>
+          </w:tcPr>
+          <w:p>
+            <w:pPr>
+              <w:spacing w:after="40"/>
+              <w:jc w:val="left"/>
+            </w:pPr>
+            <w:r/>
+            <w:r>
+              <w:rPr>
+                <w:rFonts w:ascii="Times New Roman" w:hAnsi="Times New Roman" w:eastAsia="Times New Roman"/>
+                <w:b w:val="0"/>
+                <w:i w:val="0"/>
+                <w:sz w:val="21"/>
+              </w:rPr>
+              <w:t>Lê Thị Thu Hà và Nguyễn Thành Khang (2019) đề xuất mô hình quản trị tài sản trí tuệ 5 bước.</w:t>
+            </w:r>
+          </w:p>
+        </w:tc>
+        <w:tc>
+          <w:tcPr>
+            <w:tcW w:type="dxa" w:w="4535"/>
+          </w:tcPr>
+          <w:p>
+            <w:pPr>
+              <w:spacing w:after="40"/>
+              <w:jc w:val="left"/>
+            </w:pPr>
+            <w:r/>
+            <w:r>
+              <w:rPr>
+                <w:rFonts w:ascii="Times New Roman" w:hAnsi="Times New Roman" w:eastAsia="Times New Roman"/>
+                <w:b w:val="0"/>
+                <w:i w:val="0"/>
+                <w:sz w:val="21"/>
+              </w:rPr>
+              <w:t>Mô hình 5 bước có thật và được Phạm Thị Thúy Hằng (2019) dẫn lại, nhưng bài đó ghi năm của Lê và Nguyễn là 2017 (Tạp chí Khoa học Đại học Văn Lang). Thư mục vẫn chưa có bài gốc.</w:t>
+            </w:r>
+          </w:p>
+        </w:tc>
+        <w:tc>
+          <w:tcPr>
+            <w:tcW w:type="dxa" w:w="1247"/>
+          </w:tcPr>
+          <w:p>
+            <w:pPr>
+              <w:spacing w:after="40"/>
+              <w:jc w:val="center"/>
+            </w:pPr>
+            <w:r/>
+            <w:r>
+              <w:rPr>
+                <w:rFonts w:ascii="Times New Roman" w:hAnsi="Times New Roman" w:eastAsia="Times New Roman"/>
+                <w:b/>
+                <w:i w:val="0"/>
+                <w:color w:val="B45F06"/>
+                <w:sz w:val="21"/>
+              </w:rPr>
+              <w:t>B - Cần sửa</w:t>
+            </w:r>
+          </w:p>
+        </w:tc>
+        <w:tc>
+          <w:tcPr>
+            <w:tcW w:type="dxa" w:w="2835"/>
+          </w:tcPr>
+          <w:p>
+            <w:pPr>
+              <w:spacing w:after="40"/>
+              <w:jc w:val="left"/>
+            </w:pPr>
+            <w:r/>
+            <w:r>
+              <w:rPr>
+                <w:rFonts w:ascii="Times New Roman" w:hAnsi="Times New Roman" w:eastAsia="Times New Roman"/>
+                <w:b w:val="0"/>
+                <w:i w:val="0"/>
+                <w:sz w:val="21"/>
+              </w:rPr>
+              <w:t>Kiểm tra năm xuất bản trên bài gốc.</w:t>
+            </w:r>
+          </w:p>
+        </w:tc>
+      </w:tr>
+      <w:tr>
+        <w:tc>
+          <w:tcPr>
+            <w:tcW w:type="dxa" w:w="737"/>
+          </w:tcPr>
+          <w:p>
+            <w:pPr>
+              <w:spacing w:after="40"/>
+              <w:jc w:val="center"/>
+            </w:pPr>
+            <w:r/>
+            <w:r>
+              <w:rPr>
+                <w:rFonts w:ascii="Times New Roman" w:hAnsi="Times New Roman" w:eastAsia="Times New Roman"/>
+                <w:b w:val="0"/>
+                <w:i w:val="0"/>
+                <w:sz w:val="21"/>
+              </w:rPr>
+              <w:t>47</w:t>
+            </w:r>
+          </w:p>
+        </w:tc>
+        <w:tc>
+          <w:tcPr>
+            <w:tcW w:type="dxa" w:w="1701"/>
+          </w:tcPr>
+          <w:p>
+            <w:pPr>
+              <w:spacing w:after="40"/>
+              <w:jc w:val="left"/>
+            </w:pPr>
+            <w:r/>
+            <w:r>
+              <w:rPr>
+                <w:rFonts w:ascii="Times New Roman" w:hAnsi="Times New Roman" w:eastAsia="Times New Roman"/>
+                <w:b w:val="0"/>
+                <w:i w:val="0"/>
+                <w:sz w:val="21"/>
+              </w:rPr>
+              <w:t>1.1.1</w:t>
+            </w:r>
+          </w:p>
+        </w:tc>
+        <w:tc>
+          <w:tcPr>
+            <w:tcW w:type="dxa" w:w="3515"/>
+          </w:tcPr>
+          <w:p>
+            <w:pPr>
+              <w:spacing w:after="40"/>
+              <w:jc w:val="left"/>
+            </w:pPr>
+            <w:r/>
+            <w:r>
+              <w:rPr>
+                <w:rFonts w:ascii="Times New Roman" w:hAnsi="Times New Roman" w:eastAsia="Times New Roman"/>
+                <w:b w:val="0"/>
+                <w:i w:val="0"/>
+                <w:sz w:val="21"/>
+              </w:rPr>
+              <w:t>Fisher (2001) và Guan (2014) chỉ ra tài sản trí tuệ là sự kết hợp hữu cơ giữa tính trừu tượng của ý tưởng và hình thức biểu hiện vật chất.</w:t>
+            </w:r>
+          </w:p>
+        </w:tc>
+        <w:tc>
+          <w:tcPr>
+            <w:tcW w:type="dxa" w:w="4535"/>
+          </w:tcPr>
+          <w:p>
+            <w:pPr>
+              <w:spacing w:after="40"/>
+              <w:jc w:val="left"/>
+            </w:pPr>
+            <w:r/>
+            <w:r>
+              <w:rPr>
+                <w:rFonts w:ascii="Times New Roman" w:hAnsi="Times New Roman" w:eastAsia="Times New Roman"/>
+                <w:b w:val="0"/>
+                <w:i w:val="0"/>
+                <w:sz w:val="21"/>
+              </w:rPr>
+              <w:t>Chương của Guan (2014) có trong thư mục mở đầu bằng nhận định không có định nghĩa thống nhất về sở hữu trí tuệ; không thấy luận điểm như báo cáo nêu.</w:t>
+            </w:r>
+          </w:p>
+        </w:tc>
+        <w:tc>
+          <w:tcPr>
+            <w:tcW w:type="dxa" w:w="1247"/>
+          </w:tcPr>
+          <w:p>
+            <w:pPr>
+              <w:spacing w:after="40"/>
+              <w:jc w:val="center"/>
+            </w:pPr>
+            <w:r/>
+            <w:r>
+              <w:rPr>
+                <w:rFonts w:ascii="Times New Roman" w:hAnsi="Times New Roman" w:eastAsia="Times New Roman"/>
+                <w:b/>
+                <w:i w:val="0"/>
+                <w:color w:val="B45F06"/>
+                <w:sz w:val="21"/>
+              </w:rPr>
+              <w:t>B - Cần sửa</w:t>
+            </w:r>
+          </w:p>
+        </w:tc>
+        <w:tc>
+          <w:tcPr>
+            <w:tcW w:type="dxa" w:w="2835"/>
+          </w:tcPr>
+          <w:p>
+            <w:pPr>
+              <w:spacing w:after="40"/>
+              <w:jc w:val="left"/>
+            </w:pPr>
+            <w:r/>
+            <w:r>
+              <w:rPr>
+                <w:rFonts w:ascii="Times New Roman" w:hAnsi="Times New Roman" w:eastAsia="Times New Roman"/>
+                <w:b w:val="0"/>
+                <w:i w:val="0"/>
+                <w:sz w:val="21"/>
+              </w:rPr>
+              <w:t>Diễn đạt lại đúng luận điểm của nguồn.</w:t>
+            </w:r>
+          </w:p>
+        </w:tc>
+      </w:tr>
+      <w:tr>
+        <w:tc>
+          <w:tcPr>
+            <w:tcW w:type="dxa" w:w="737"/>
+          </w:tcPr>
+          <w:p>
+            <w:pPr>
+              <w:spacing w:after="40"/>
+              <w:jc w:val="center"/>
+            </w:pPr>
+            <w:r/>
+            <w:r>
+              <w:rPr>
+                <w:rFonts w:ascii="Times New Roman" w:hAnsi="Times New Roman" w:eastAsia="Times New Roman"/>
+                <w:b w:val="0"/>
+                <w:i w:val="0"/>
+                <w:sz w:val="21"/>
+              </w:rPr>
+              <w:t>48</w:t>
+            </w:r>
+          </w:p>
+        </w:tc>
+        <w:tc>
+          <w:tcPr>
+            <w:tcW w:type="dxa" w:w="1701"/>
+          </w:tcPr>
+          <w:p>
+            <w:pPr>
+              <w:spacing w:after="40"/>
+              <w:jc w:val="left"/>
+            </w:pPr>
+            <w:r/>
+            <w:r>
+              <w:rPr>
+                <w:rFonts w:ascii="Times New Roman" w:hAnsi="Times New Roman" w:eastAsia="Times New Roman"/>
+                <w:b w:val="0"/>
+                <w:i w:val="0"/>
+                <w:sz w:val="21"/>
+              </w:rPr>
+              <w:t>Mở đầu 2.1 (Thứ ba)</w:t>
+            </w:r>
+          </w:p>
+        </w:tc>
+        <w:tc>
+          <w:tcPr>
+            <w:tcW w:type="dxa" w:w="3515"/>
+          </w:tcPr>
+          <w:p>
+            <w:pPr>
+              <w:spacing w:after="40"/>
+              <w:jc w:val="left"/>
+            </w:pPr>
+            <w:r/>
+            <w:r>
+              <w:rPr>
+                <w:rFonts w:ascii="Times New Roman" w:hAnsi="Times New Roman" w:eastAsia="Times New Roman"/>
+                <w:b w:val="0"/>
+                <w:i w:val="0"/>
+                <w:sz w:val="21"/>
+              </w:rPr>
+              <w:t>Phạm Thị Thúy Hằng và Nguyễn Thanh Hùng (2018) nghiên cứu mô hình quản lý sở hữu trí tuệ 3 cấp của Đại học Thanh Hoa, nêu chính sách dành 50% - 70% doanh thu cấp phép cho tác giả.</w:t>
+            </w:r>
+          </w:p>
+        </w:tc>
+        <w:tc>
+          <w:tcPr>
+            <w:tcW w:type="dxa" w:w="4535"/>
+          </w:tcPr>
+          <w:p>
+            <w:pPr>
+              <w:spacing w:after="40"/>
+              <w:jc w:val="left"/>
+            </w:pPr>
+            <w:r/>
+            <w:r>
+              <w:rPr>
+                <w:rFonts w:ascii="Times New Roman" w:hAnsi="Times New Roman" w:eastAsia="Times New Roman"/>
+                <w:b w:val="0"/>
+                <w:i w:val="0"/>
+                <w:sz w:val="21"/>
+              </w:rPr>
+              <w:t>Bài gốc ghi lợi ích của nhà phát minh tối thiểu 25% doanh thu tạo ra từ sở hữu trí tuệ; không có tỷ lệ 50% - 70% và không mô tả mô hình 3 cấp. Đầu mối quản lý là văn phòng chuyển giao công nghệ, cùng ủy ban sở hữu trí tuệ của trường.</w:t>
+            </w:r>
+          </w:p>
+        </w:tc>
+        <w:tc>
+          <w:tcPr>
+            <w:tcW w:type="dxa" w:w="1247"/>
+          </w:tcPr>
+          <w:p>
+            <w:pPr>
+              <w:spacing w:after="40"/>
+              <w:jc w:val="center"/>
+            </w:pPr>
+            <w:r/>
+            <w:r>
+              <w:rPr>
+                <w:rFonts w:ascii="Times New Roman" w:hAnsi="Times New Roman" w:eastAsia="Times New Roman"/>
+                <w:b/>
+                <w:i w:val="0"/>
+                <w:color w:val="C00000"/>
+                <w:sz w:val="21"/>
+              </w:rPr>
+              <w:t>A - Phải sửa trước khi nộp</w:t>
+            </w:r>
+          </w:p>
+        </w:tc>
+        <w:tc>
+          <w:tcPr>
+            <w:tcW w:type="dxa" w:w="2835"/>
+          </w:tcPr>
+          <w:p>
+            <w:pPr>
+              <w:spacing w:after="40"/>
+              <w:jc w:val="left"/>
+            </w:pPr>
+            <w:r/>
+            <w:r>
+              <w:rPr>
+                <w:rFonts w:ascii="Times New Roman" w:hAnsi="Times New Roman" w:eastAsia="Times New Roman"/>
+                <w:b w:val="0"/>
+                <w:i w:val="0"/>
+                <w:sz w:val="21"/>
+              </w:rPr>
+              <w:t>Sửa thành tối thiểu 25% doanh thu; bỏ cụm mô hình 3 cấp.</w:t>
+            </w:r>
+          </w:p>
+        </w:tc>
+      </w:tr>
+      <w:tr>
+        <w:tc>
+          <w:tcPr>
+            <w:tcW w:type="dxa" w:w="737"/>
+          </w:tcPr>
+          <w:p>
+            <w:pPr>
+              <w:spacing w:after="40"/>
+              <w:jc w:val="center"/>
+            </w:pPr>
+            <w:r/>
+            <w:r>
+              <w:rPr>
+                <w:rFonts w:ascii="Times New Roman" w:hAnsi="Times New Roman" w:eastAsia="Times New Roman"/>
+                <w:b w:val="0"/>
+                <w:i w:val="0"/>
+                <w:sz w:val="21"/>
+              </w:rPr>
+              <w:t>49</w:t>
+            </w:r>
+          </w:p>
+        </w:tc>
+        <w:tc>
+          <w:tcPr>
+            <w:tcW w:type="dxa" w:w="1701"/>
+          </w:tcPr>
+          <w:p>
+            <w:pPr>
+              <w:spacing w:after="40"/>
+              <w:jc w:val="left"/>
+            </w:pPr>
+            <w:r/>
+            <w:r>
+              <w:rPr>
+                <w:rFonts w:ascii="Times New Roman" w:hAnsi="Times New Roman" w:eastAsia="Times New Roman"/>
+                <w:b w:val="0"/>
+                <w:i w:val="0"/>
+                <w:sz w:val="21"/>
+              </w:rPr>
+              <w:t>Mở đầu 2.2 (Thứ nhất)</w:t>
+            </w:r>
+          </w:p>
+        </w:tc>
+        <w:tc>
+          <w:tcPr>
+            <w:tcW w:type="dxa" w:w="3515"/>
+          </w:tcPr>
+          <w:p>
+            <w:pPr>
+              <w:spacing w:after="40"/>
+              <w:jc w:val="left"/>
+            </w:pPr>
+            <w:r/>
+            <w:r>
+              <w:rPr>
+                <w:rFonts w:ascii="Times New Roman" w:hAnsi="Times New Roman" w:eastAsia="Times New Roman"/>
+                <w:b w:val="0"/>
+                <w:i w:val="0"/>
+                <w:sz w:val="21"/>
+              </w:rPr>
+              <w:t>Maresova et al. (2019) tổng quan 22 công trình, phân loại theo bốn trụ cột.</w:t>
+            </w:r>
+          </w:p>
+        </w:tc>
+        <w:tc>
+          <w:tcPr>
+            <w:tcW w:type="dxa" w:w="4535"/>
+          </w:tcPr>
+          <w:p>
+            <w:pPr>
+              <w:spacing w:after="40"/>
+              <w:jc w:val="left"/>
+            </w:pPr>
+            <w:r/>
+            <w:r>
+              <w:rPr>
+                <w:rFonts w:ascii="Times New Roman" w:hAnsi="Times New Roman" w:eastAsia="Times New Roman"/>
+                <w:b w:val="0"/>
+                <w:i w:val="0"/>
+                <w:sz w:val="21"/>
+              </w:rPr>
+              <w:t>Thư mục vẫn chưa có bản gốc bài này nên chưa kiểm chứng được; con số đã có từ bản thuyết minh đề tài.</w:t>
+            </w:r>
+          </w:p>
+        </w:tc>
+        <w:tc>
+          <w:tcPr>
+            <w:tcW w:type="dxa" w:w="1247"/>
+          </w:tcPr>
+          <w:p>
+            <w:pPr>
+              <w:spacing w:after="40"/>
+              <w:jc w:val="center"/>
+            </w:pPr>
+            <w:r/>
+            <w:r>
+              <w:rPr>
+                <w:rFonts w:ascii="Times New Roman" w:hAnsi="Times New Roman" w:eastAsia="Times New Roman"/>
+                <w:b/>
+                <w:i w:val="0"/>
+                <w:color w:val="B45F06"/>
+                <w:sz w:val="21"/>
+              </w:rPr>
+              <w:t>B - Cần sửa</w:t>
+            </w:r>
+          </w:p>
+        </w:tc>
+        <w:tc>
+          <w:tcPr>
+            <w:tcW w:type="dxa" w:w="2835"/>
+          </w:tcPr>
+          <w:p>
+            <w:pPr>
+              <w:spacing w:after="40"/>
+              <w:jc w:val="left"/>
+            </w:pPr>
+            <w:r/>
+            <w:r>
+              <w:rPr>
+                <w:rFonts w:ascii="Times New Roman" w:hAnsi="Times New Roman" w:eastAsia="Times New Roman"/>
+                <w:b w:val="0"/>
+                <w:i w:val="0"/>
+                <w:sz w:val="21"/>
+              </w:rPr>
+              <w:t>Kiểm tra trên bản gốc (truy cập mở, doi.org/10.3390/admsci9030067).</w:t>
             </w:r>
           </w:p>
         </w:tc>
@@ -6588,7 +7507,7 @@
                 <w:i w:val="0"/>
                 <w:sz w:val="21"/>
               </w:rPr>
-              <w:t>43</w:t>
+              <w:t>50</w:t>
             </w:r>
           </w:p>
         </w:tc>
@@ -7133,7 +8052,7 @@
                 <w:i w:val="0"/>
                 <w:sz w:val="21"/>
               </w:rPr>
-              <w:t>Tạp chí Khoa học Đại học Văn Lang, 18, 27-36</w:t>
+              <w:t>Tạp chí Khoa học Đại học Văn Lang, 18, 27-36 (theo tệp Zotero; Phạm Thị Thúy Hằng (2019) dẫn bài này với năm 2017, cần kiểm tra)</w:t>
             </w:r>
           </w:p>
         </w:tc>
@@ -7198,7 +8117,7 @@
                 <w:i w:val="0"/>
                 <w:sz w:val="21"/>
               </w:rPr>
-              <w:t>Tạp chí Khoa học Quản lý Giáo dục, 2(30), 38-45</w:t>
+              <w:t>Tạp chí Khoa học Quản lý Giáo dục, số 02(30), 38-45 (bản PDF)</w:t>
             </w:r>
           </w:p>
         </w:tc>
@@ -7221,7 +8140,7 @@
                 <w:i w:val="0"/>
                 <w:sz w:val="21"/>
               </w:rPr>
-              <w:t>Phạm, T. T. H., &amp; Nguyễn, T. H. (2018)</w:t>
+              <w:t>Phạm, T. H. (2019)</w:t>
             </w:r>
           </w:p>
         </w:tc>
@@ -7242,7 +8161,7 @@
                 <w:i w:val="0"/>
                 <w:sz w:val="21"/>
               </w:rPr>
-              <w:t>Bài học từ Đại học Bách khoa Hà Nội; Tạp chí Khoa học và Công nghệ Việt Nam, 60(9)</w:t>
+              <w:t>Tác giả ghi Phạm, T. H. (Phạm Thúy Hằng)</w:t>
             </w:r>
           </w:p>
         </w:tc>
@@ -7263,7 +8182,7 @@
                 <w:i w:val="0"/>
                 <w:sz w:val="21"/>
               </w:rPr>
-              <w:t>Bài học từ Đại học Thanh Hoa, Trung Quốc; Tạp chí Khoa học và Giáo dục, Trường ĐHSP Huế, 3(47), 84-94</w:t>
+              <w:t>Phạm, T. T. H. (2019), Phạm Thị Thúy Hằng; Tạp chí Khoa học Quản lý Giáo dục, số 02(22), 20-28 (bản PDF). Tệp Zotero cũng ghi sai tên này</w:t>
             </w:r>
           </w:p>
         </w:tc>
@@ -7286,7 +8205,7 @@
                 <w:i w:val="0"/>
                 <w:sz w:val="21"/>
               </w:rPr>
-              <w:t>Cục Sở hữu trí tuệ &amp; Bộ KH&amp;CN (2024)</w:t>
+              <w:t>Phạm, T. T. H., &amp; Nguyễn, T. H. (2018)</w:t>
             </w:r>
           </w:p>
         </w:tc>
@@ -7307,7 +8226,7 @@
                 <w:i w:val="0"/>
                 <w:sz w:val="21"/>
               </w:rPr>
-              <w:t>Kỷ yếu hội thảo khoa học quốc gia</w:t>
+              <w:t>Bài học từ Đại học Bách khoa Hà Nội; Tạp chí Khoa học và Công nghệ Việt Nam, 60(9)</w:t>
             </w:r>
           </w:p>
         </w:tc>
@@ -7328,7 +8247,7 @@
                 <w:i w:val="0"/>
                 <w:sz w:val="21"/>
               </w:rPr>
-              <w:t>Nhà xuất bản Khoa học và Kỹ thuật</w:t>
+              <w:t>Bài học từ Đại học Thanh Hoa, Trung Quốc; Tạp chí Khoa học và Giáo dục, Trường ĐHSP Huế, 3(47), 84-94 (bản PDF)</w:t>
             </w:r>
           </w:p>
         </w:tc>
@@ -7351,7 +8270,7 @@
                 <w:i w:val="0"/>
                 <w:sz w:val="21"/>
               </w:rPr>
-              <w:t>Cục Sở hữu trí tuệ, tài liệu tập huấn</w:t>
+              <w:t>Cục Sở hữu trí tuệ &amp; Bộ KH&amp;CN (2024)</w:t>
             </w:r>
           </w:p>
         </w:tc>
@@ -7372,7 +8291,7 @@
                 <w:i w:val="0"/>
                 <w:sz w:val="21"/>
               </w:rPr>
-              <w:t>Năm 2024, Trung tâm Đào tạo Sở hữu trí tuệ</w:t>
+              <w:t>Kỷ yếu hội thảo khoa học quốc gia</w:t>
             </w:r>
           </w:p>
         </w:tc>
@@ -7393,7 +8312,7 @@
                 <w:i w:val="0"/>
                 <w:sz w:val="21"/>
               </w:rPr>
-              <w:t>Không ghi năm (n.d.), kèm địa chỉ truy cập</w:t>
+              <w:t>Nhà xuất bản Khoa học và Kỹ thuật</w:t>
             </w:r>
           </w:p>
         </w:tc>
@@ -7416,7 +8335,7 @@
                 <w:i w:val="0"/>
                 <w:sz w:val="21"/>
               </w:rPr>
-              <w:t>Bstieler et al. (2015)</w:t>
+              <w:t>Cục Sở hữu trí tuệ, tài liệu tập huấn</w:t>
             </w:r>
           </w:p>
         </w:tc>
@@ -7437,7 +8356,7 @@
                 <w:i w:val="0"/>
                 <w:sz w:val="21"/>
               </w:rPr>
-              <w:t>Tên bài rút gọn; trang 100-112; danh mục ở Mở đầu ghi DOI 10.1111/jpim.12244</w:t>
+              <w:t>Năm 2024, Trung tâm Đào tạo Sở hữu trí tuệ</w:t>
             </w:r>
           </w:p>
         </w:tc>
@@ -7458,7 +8377,7 @@
                 <w:i w:val="0"/>
                 <w:sz w:val="21"/>
               </w:rPr>
-              <w:t>... U.S. biotechnology industry: IP policies, shared governance, and champions; 32(1), 111-121; DOI đúng 10.1111/jpim.12242 (trang Wiley)</w:t>
+              <w:t>Không ghi năm (n.d.), kèm địa chỉ truy cập</w:t>
             </w:r>
           </w:p>
         </w:tc>
@@ -7481,7 +8400,7 @@
                 <w:i w:val="0"/>
                 <w:sz w:val="21"/>
               </w:rPr>
-              <w:t>Bulsara &amp; Vaghela (2025)</w:t>
+              <w:t>Bstieler et al. (2015)</w:t>
             </w:r>
           </w:p>
         </w:tc>
@@ -7502,7 +8421,7 @@
                 <w:i w:val="0"/>
                 <w:sz w:val="21"/>
               </w:rPr>
-              <w:t>International Journal of Innovation Studies, 9(2), 145-159 (danh mục ở Mở đầu ghi Tech Monitor, WIPO)</w:t>
+              <w:t>Tên bài rút gọn; trang 100-112; danh mục ở Mở đầu ghi DOI 10.1111/jpim.12244</w:t>
             </w:r>
           </w:p>
         </w:tc>
@@ -7523,7 +8442,7 @@
                 <w:i w:val="0"/>
                 <w:sz w:val="21"/>
               </w:rPr>
-              <w:t>Asia-Pacific Tech Monitor, 42(2), tháng 4 - 6/2025, do APCTT (ESCAP) xuất bản, không phải WIPO</w:t>
+              <w:t>... U.S. biotechnology industry: IP policies, shared governance, and champions; 32(1), 111-121; DOI đúng 10.1111/jpim.12242 (bản PDF)</w:t>
             </w:r>
           </w:p>
         </w:tc>
@@ -7546,7 +8465,7 @@
                 <w:i w:val="0"/>
                 <w:sz w:val="21"/>
               </w:rPr>
-              <w:t>Holgersson (2021)</w:t>
+              <w:t>Bulsara &amp; Vaghela (2025)</w:t>
             </w:r>
           </w:p>
         </w:tc>
@@ -7567,7 +8486,7 @@
                 <w:i w:val="0"/>
                 <w:sz w:val="21"/>
               </w:rPr>
-              <w:t>European Journal of Innovation Management, 24(5), 1421-1440 (danh mục ở Mở đầu ghi European Patent Office)</w:t>
+              <w:t>International Journal of Innovation Studies, 9(2), 145-159 (danh mục ở Mở đầu ghi Tech Monitor, WIPO)</w:t>
             </w:r>
           </w:p>
         </w:tc>
@@ -7588,7 +8507,7 @@
                 <w:i w:val="0"/>
                 <w:sz w:val="21"/>
               </w:rPr>
-              <w:t>Báo cáo của European Commission, Directorate-General for Research and Innovation; tác giả hoàn thành tháng 10/2021, phát hành ngày 02/3/2022</w:t>
+              <w:t>Asia-Pacific Tech Monitor, 42(2), tháng 4 - 6/2025, do APCTT (ESCAP) xuất bản, không phải WIPO (bản PDF)</w:t>
             </w:r>
           </w:p>
         </w:tc>
@@ -7611,7 +8530,7 @@
                 <w:i w:val="0"/>
                 <w:sz w:val="21"/>
               </w:rPr>
-              <w:t>Holgersson &amp; Aaboen (2019)</w:t>
+              <w:t>Holgersson (2021)</w:t>
             </w:r>
           </w:p>
         </w:tc>
@@ -7632,7 +8551,7 @@
                 <w:i w:val="0"/>
                 <w:sz w:val="21"/>
               </w:rPr>
-              <w:t>The Journal of Technology Transfer, 44(3), 856-887</w:t>
+              <w:t>European Journal of Innovation Management, 24(5), 1421-1440 (danh mục ở Mở đầu ghi European Patent Office)</w:t>
             </w:r>
           </w:p>
         </w:tc>
@@ -7653,7 +8572,7 @@
                 <w:i w:val="0"/>
                 <w:sz w:val="21"/>
               </w:rPr>
-              <w:t>Technology in Society, 59, Article 101132</w:t>
+              <w:t>Báo cáo của European Commission, Directorate-General for Research and Innovation; tác giả hoàn thành tháng 10/2021, xuất bản năm 2022, doi:10.2777/969317 (bản PDF)</w:t>
             </w:r>
           </w:p>
         </w:tc>
@@ -7676,7 +8595,7 @@
                 <w:i w:val="0"/>
                 <w:sz w:val="21"/>
               </w:rPr>
-              <w:t>Maresova et al. (2019)</w:t>
+              <w:t>Holgersson &amp; Aaboen (2019)</w:t>
             </w:r>
           </w:p>
         </w:tc>
@@ -7697,7 +8616,7 @@
                 <w:i w:val="0"/>
                 <w:sz w:val="21"/>
               </w:rPr>
-              <w:t>Economies, 7(4), 105</w:t>
+              <w:t>The Journal of Technology Transfer, 44(3), 856-887</w:t>
             </w:r>
           </w:p>
         </w:tc>
@@ -7718,7 +8637,7 @@
                 <w:i w:val="0"/>
                 <w:sz w:val="21"/>
               </w:rPr>
-              <w:t>Administrative Sciences, 9(3), Article 67</w:t>
+              <w:t>Technology in Society, 59, Article 101132 (bản PDF)</w:t>
             </w:r>
           </w:p>
         </w:tc>
@@ -7741,7 +8660,7 @@
                 <w:i w:val="0"/>
                 <w:sz w:val="21"/>
               </w:rPr>
-              <w:t>Öztürk (2026)</w:t>
+              <w:t>Maresova et al. (2019)</w:t>
             </w:r>
           </w:p>
         </w:tc>
@@ -7762,7 +8681,7 @@
                 <w:i w:val="0"/>
                 <w:sz w:val="21"/>
               </w:rPr>
-              <w:t>Higher Education Policy, 39(1), 89-112</w:t>
+              <w:t>Economies, 7(4), 105</w:t>
             </w:r>
           </w:p>
         </w:tc>
@@ -7783,7 +8702,7 @@
                 <w:i w:val="0"/>
                 <w:sz w:val="21"/>
               </w:rPr>
-              <w:t>Scientific Culture, 12(3.1), 287-303</w:t>
+              <w:t>Administrative Sciences, 9(3), Article 67</w:t>
             </w:r>
           </w:p>
         </w:tc>
@@ -7806,7 +8725,7 @@
                 <w:i w:val="0"/>
                 <w:sz w:val="21"/>
               </w:rPr>
-              <w:t>Pandey et al. (2025)</w:t>
+              <w:t>Öztürk (2026)</w:t>
             </w:r>
           </w:p>
         </w:tc>
@@ -7827,7 +8746,7 @@
                 <w:i w:val="0"/>
                 <w:sz w:val="21"/>
               </w:rPr>
-              <w:t>Tên bài ghi Higher Education Institutions; 30(1), 45-56</w:t>
+              <w:t>Higher Education Policy, 39(1), 89-112</w:t>
             </w:r>
           </w:p>
         </w:tc>
@@ -7848,7 +8767,7 @@
                 <w:i w:val="0"/>
                 <w:sz w:val="21"/>
               </w:rPr>
-              <w:t>... in Academic Institutions; 30, 640-649</w:t>
+              <w:t>Scientific Culture, 12(3.1), 287-303 (bản PDF)</w:t>
             </w:r>
           </w:p>
         </w:tc>
@@ -7871,6 +8790,71 @@
                 <w:i w:val="0"/>
                 <w:sz w:val="21"/>
               </w:rPr>
+              <w:t>Pandey et al. (2025)</w:t>
+            </w:r>
+          </w:p>
+        </w:tc>
+        <w:tc>
+          <w:tcPr>
+            <w:tcW w:type="dxa" w:w="5669"/>
+          </w:tcPr>
+          <w:p>
+            <w:pPr>
+              <w:spacing w:after="40"/>
+              <w:jc w:val="left"/>
+            </w:pPr>
+            <w:r/>
+            <w:r>
+              <w:rPr>
+                <w:rFonts w:ascii="Times New Roman" w:hAnsi="Times New Roman" w:eastAsia="Times New Roman"/>
+                <w:b w:val="0"/>
+                <w:i w:val="0"/>
+                <w:sz w:val="21"/>
+              </w:rPr>
+              <w:t>Tên bài ghi Higher Education Institutions; 30(1), 45-56</w:t>
+            </w:r>
+          </w:p>
+        </w:tc>
+        <w:tc>
+          <w:tcPr>
+            <w:tcW w:type="dxa" w:w="6066"/>
+          </w:tcPr>
+          <w:p>
+            <w:pPr>
+              <w:spacing w:after="40"/>
+              <w:jc w:val="left"/>
+            </w:pPr>
+            <w:r/>
+            <w:r>
+              <w:rPr>
+                <w:rFonts w:ascii="Times New Roman" w:hAnsi="Times New Roman" w:eastAsia="Times New Roman"/>
+                <w:b w:val="0"/>
+                <w:i w:val="0"/>
+                <w:sz w:val="21"/>
+              </w:rPr>
+              <w:t>... in Academic Institutions; 30(5), 640-649; tác giả thứ ba Sanjeeva Kumar Majumdar (bản PDF)</w:t>
+            </w:r>
+          </w:p>
+        </w:tc>
+      </w:tr>
+      <w:tr>
+        <w:tc>
+          <w:tcPr>
+            <w:tcW w:type="dxa" w:w="2835"/>
+          </w:tcPr>
+          <w:p>
+            <w:pPr>
+              <w:spacing w:after="40"/>
+              <w:jc w:val="left"/>
+            </w:pPr>
+            <w:r/>
+            <w:r>
+              <w:rPr>
+                <w:rFonts w:ascii="Times New Roman" w:hAnsi="Times New Roman" w:eastAsia="Times New Roman"/>
+                <w:b w:val="0"/>
+                <w:i w:val="0"/>
+                <w:sz w:val="21"/>
+              </w:rPr>
               <w:t>Rocha et al. (2023)</w:t>
             </w:r>
           </w:p>
@@ -7913,7 +8897,7 @@
                 <w:i w:val="0"/>
                 <w:sz w:val="21"/>
               </w:rPr>
-              <w:t>International Journal of Entrepreneurship and Innovation Management, 27(1/2), 119-136</w:t>
+              <w:t>International Journal of Entrepreneurship and Innovation Management, 27(1/2), 119-136 (bản PDF)</w:t>
             </w:r>
           </w:p>
         </w:tc>
@@ -7946,7 +8930,7 @@
           <w:i w:val="0"/>
           <w:sz w:val="26"/>
         </w:rPr>
-        <w:t>Các nội dung sau chưa có văn bản gốc trong hồ sơ; cần bổ sung để giữ lại, nếu không thì bỏ: hai hợp đồng chuyển giao quyền sử dụng sách; Điều lệ Quỹ Học bổng sau tiến sĩ Ngô Xuân Độ; quy định về tỷ lệ trùng lặp; quyết định thành lập Trường; bản gốc các bài của Maresova et al., Phạm và Nguyễn (2018), Lê và Nguyễn (2019) để kiểm tra các con số được dẫn.</w:t>
+        <w:t>Các nội dung sau chưa có văn bản gốc trong hồ sơ; cần bổ sung để giữ lại, nếu không thì bỏ: hai hợp đồng chuyển giao quyền sử dụng sách; Điều lệ Quỹ Học bổng sau tiến sĩ Ngô Xuân Độ; quy định về tỷ lệ trùng lặp; quyết định thành lập Trường; bản gốc bài của Maresova et al. (2019) và bài của Lê và Nguyễn (Tạp chí Khoa học Đại học Văn Lang) để kiểm tra các con số và năm xuất bản.</w:t>
       </w:r>
     </w:p>
     <w:sectPr>

</xml_diff>